<commit_message>
add tests and update mom
</commit_message>
<xml_diff>
--- a/docs/MinutesofProjectMeetings_Feb26-Apr26.docx
+++ b/docs/MinutesofProjectMeetings_Feb26-Apr26.docx
@@ -1336,13 +1336,7 @@
         <w:jc w:val="both"/>
       </w:pPr>
       <w:r>
-        <w:t xml:space="preserve">Expected testing levels: unit testing and integration testing (standard practice), systems testing (scaling up), and User Acceptance Testing (can </w:t>
-      </w:r>
-      <w:r>
-        <w:t>users’</w:t>
-      </w:r>
-      <w:r>
-        <w:t xml:space="preserve"> complete tasks unprompted?).</w:t>
+        <w:t>Expected testing levels: unit testing and integration testing (standard practice), systems testing (scaling up), and User Acceptance Testing (can users’ complete tasks unprompted?).</w:t>
       </w:r>
     </w:p>
     <w:p>
@@ -2192,12 +2186,6 @@
         <w:spacing w:line="360" w:lineRule="auto"/>
         <w:jc w:val="both"/>
       </w:pPr>
-    </w:p>
-    <w:p>
-      <w:pPr>
-        <w:spacing w:line="360" w:lineRule="auto"/>
-        <w:jc w:val="both"/>
-      </w:pPr>
       <w:r>
         <w:rPr>
           <w:b/>
@@ -2219,15 +2207,1323 @@
       <w:pPr>
         <w:spacing w:line="360" w:lineRule="auto"/>
         <w:jc w:val="both"/>
-      </w:pPr>
-      <w:r>
         <w:rPr>
           <w:b/>
           <w:bCs/>
           <w:u w:val="single"/>
         </w:rPr>
+      </w:pPr>
+      <w:r>
+        <w:rPr>
+          <w:b/>
+          <w:bCs/>
+          <w:u w:val="single"/>
+        </w:rPr>
         <w:t>Supervisor’s Comments:</w:t>
       </w:r>
+    </w:p>
+    <w:p>
+      <w:pPr>
+        <w:spacing w:after="160" w:line="278" w:lineRule="auto"/>
+        <w:rPr>
+          <w:b/>
+          <w:bCs/>
+          <w:u w:val="single"/>
+        </w:rPr>
+      </w:pPr>
+      <w:r>
+        <w:rPr>
+          <w:b/>
+          <w:bCs/>
+          <w:u w:val="single"/>
+        </w:rPr>
+        <w:br w:type="page"/>
+      </w:r>
+    </w:p>
+    <w:p>
+      <w:pPr>
+        <w:spacing w:line="360" w:lineRule="auto"/>
+        <w:jc w:val="both"/>
+      </w:pPr>
+      <w:r>
+        <w:rPr>
+          <w:b/>
+          <w:bCs/>
+        </w:rPr>
+        <w:lastRenderedPageBreak/>
+        <w:t>QUEEN’S UNIVERSITY OF BELFAST COMPUTER SCIENCE</w:t>
+      </w:r>
+    </w:p>
+    <w:p>
+      <w:pPr>
+        <w:spacing w:line="360" w:lineRule="auto"/>
+        <w:jc w:val="both"/>
+      </w:pPr>
+      <w:r>
+        <w:rPr>
+          <w:b/>
+          <w:bCs/>
+        </w:rPr>
+        <w:t>Minutes of Project Supervision Meeting</w:t>
+      </w:r>
+    </w:p>
+    <w:p>
+      <w:pPr>
+        <w:spacing w:line="360" w:lineRule="auto"/>
+        <w:jc w:val="both"/>
+      </w:pPr>
+      <w:r>
+        <w:rPr>
+          <w:b/>
+          <w:bCs/>
+        </w:rPr>
+        <w:t xml:space="preserve">Student Name: </w:t>
+      </w:r>
+      <w:r>
+        <w:t>Gabriella Keisha Andini</w:t>
+      </w:r>
+    </w:p>
+    <w:p>
+      <w:pPr>
+        <w:spacing w:line="360" w:lineRule="auto"/>
+        <w:jc w:val="both"/>
+      </w:pPr>
+      <w:r>
+        <w:rPr>
+          <w:b/>
+          <w:bCs/>
+        </w:rPr>
+        <w:t xml:space="preserve">Project Module Code: </w:t>
+      </w:r>
+      <w:r>
+        <w:t>CSC3002</w:t>
+      </w:r>
+    </w:p>
+    <w:p>
+      <w:pPr>
+        <w:spacing w:line="360" w:lineRule="auto"/>
+        <w:jc w:val="both"/>
+      </w:pPr>
+      <w:r>
+        <w:rPr>
+          <w:b/>
+          <w:bCs/>
+        </w:rPr>
+        <w:t xml:space="preserve">Project Supervisor: </w:t>
+      </w:r>
+      <w:r>
+        <w:t>Andrew McDowell</w:t>
+      </w:r>
+    </w:p>
+    <w:p>
+      <w:pPr>
+        <w:spacing w:line="360" w:lineRule="auto"/>
+        <w:jc w:val="both"/>
+      </w:pPr>
+      <w:r>
+        <w:rPr>
+          <w:b/>
+          <w:bCs/>
+        </w:rPr>
+        <w:t xml:space="preserve">Meeting Number: </w:t>
+      </w:r>
+      <w:r>
+        <w:t>17</w:t>
+      </w:r>
+    </w:p>
+    <w:p>
+      <w:pPr>
+        <w:spacing w:line="360" w:lineRule="auto"/>
+        <w:jc w:val="both"/>
+      </w:pPr>
+      <w:r>
+        <w:rPr>
+          <w:b/>
+          <w:bCs/>
+        </w:rPr>
+        <w:t xml:space="preserve">Date of Meeting: </w:t>
+      </w:r>
+      <w:r>
+        <w:t>12/03/2026</w:t>
+      </w:r>
+    </w:p>
+    <w:p>
+      <w:pPr>
+        <w:spacing w:line="360" w:lineRule="auto"/>
+        <w:jc w:val="both"/>
+      </w:pPr>
+    </w:p>
+    <w:p>
+      <w:pPr>
+        <w:spacing w:line="360" w:lineRule="auto"/>
+        <w:jc w:val="both"/>
+      </w:pPr>
+      <w:r>
+        <w:rPr>
+          <w:b/>
+          <w:bCs/>
+          <w:u w:val="single"/>
+        </w:rPr>
+        <w:t>Progress since the last meeting, and decisions arrived at during the meeting:</w:t>
+      </w:r>
+    </w:p>
+    <w:p>
+      <w:pPr>
+        <w:spacing w:line="360" w:lineRule="auto"/>
+        <w:jc w:val="both"/>
+      </w:pPr>
+      <w:r>
+        <w:rPr>
+          <w:b/>
+          <w:bCs/>
+        </w:rPr>
+        <w:t>Gemini AI Integration Attempt:</w:t>
+      </w:r>
+    </w:p>
+    <w:p>
+      <w:pPr>
+        <w:numPr>
+          <w:ilvl w:val="0"/>
+          <w:numId w:val="3"/>
+        </w:numPr>
+        <w:spacing w:line="360" w:lineRule="auto"/>
+        <w:jc w:val="both"/>
+      </w:pPr>
+      <w:r>
+        <w:t>A</w:t>
+      </w:r>
+      <w:r>
+        <w:t>ttempted to integrate Google Gemini for AI-powered session summarisation.</w:t>
+      </w:r>
+    </w:p>
+    <w:p>
+      <w:pPr>
+        <w:numPr>
+          <w:ilvl w:val="0"/>
+          <w:numId w:val="3"/>
+        </w:numPr>
+        <w:spacing w:line="360" w:lineRule="auto"/>
+        <w:jc w:val="both"/>
+      </w:pPr>
+      <w:r>
+        <w:t>Encountered issues with Google AI Studio access and billing/token authentication errors when using the Google Cloud API key</w:t>
+      </w:r>
+      <w:r>
+        <w:t>, a</w:t>
+      </w:r>
+      <w:r>
+        <w:t>dvised not to spend too long on this issue</w:t>
+      </w:r>
+      <w:r>
+        <w:t>.</w:t>
+      </w:r>
+    </w:p>
+    <w:p>
+      <w:pPr>
+        <w:spacing w:line="360" w:lineRule="auto"/>
+        <w:jc w:val="both"/>
+      </w:pPr>
+      <w:r>
+        <w:rPr>
+          <w:b/>
+          <w:bCs/>
+        </w:rPr>
+        <w:t>Current AI Summarisation Status:</w:t>
+      </w:r>
+    </w:p>
+    <w:p>
+      <w:pPr>
+        <w:numPr>
+          <w:ilvl w:val="0"/>
+          <w:numId w:val="3"/>
+        </w:numPr>
+        <w:spacing w:line="360" w:lineRule="auto"/>
+        <w:jc w:val="both"/>
+      </w:pPr>
+      <w:r>
+        <w:t>Two summarisation approaches currently implemented: Hugging Face model and a manual rule-based approach (coded in-house using TF-IDF keyword extraction and template-based summary generation).</w:t>
+      </w:r>
+    </w:p>
+    <w:p>
+      <w:pPr>
+        <w:numPr>
+          <w:ilvl w:val="0"/>
+          <w:numId w:val="3"/>
+        </w:numPr>
+        <w:spacing w:line="360" w:lineRule="auto"/>
+        <w:jc w:val="both"/>
+      </w:pPr>
+      <w:r>
+        <w:t>Keyword extraction improved</w:t>
+      </w:r>
+      <w:r>
+        <w:t xml:space="preserve">: </w:t>
+      </w:r>
+      <w:r>
+        <w:t>unnecessary filler/stop words have been reduced.</w:t>
+      </w:r>
+    </w:p>
+    <w:p>
+      <w:pPr>
+        <w:numPr>
+          <w:ilvl w:val="0"/>
+          <w:numId w:val="3"/>
+        </w:numPr>
+        <w:spacing w:line="360" w:lineRule="auto"/>
+        <w:jc w:val="both"/>
+      </w:pPr>
+      <w:r>
+        <w:t>Observed</w:t>
+      </w:r>
+      <w:r>
+        <w:t xml:space="preserve"> that the manual rule-based summary is currently producing better results than the Hugging Face model for session summaries.</w:t>
+      </w:r>
+    </w:p>
+    <w:p>
+      <w:pPr>
+        <w:spacing w:line="360" w:lineRule="auto"/>
+        <w:jc w:val="both"/>
+      </w:pPr>
+      <w:r>
+        <w:rPr>
+          <w:b/>
+          <w:bCs/>
+        </w:rPr>
+        <w:t>Discussion on Keeping Both Approaches:</w:t>
+      </w:r>
+    </w:p>
+    <w:p>
+      <w:pPr>
+        <w:numPr>
+          <w:ilvl w:val="0"/>
+          <w:numId w:val="3"/>
+        </w:numPr>
+        <w:spacing w:line="360" w:lineRule="auto"/>
+        <w:jc w:val="both"/>
+      </w:pPr>
+      <w:r>
+        <w:t>Get confirmed</w:t>
+      </w:r>
+      <w:r>
+        <w:t xml:space="preserve"> it is valid to keep both the Hugging Face and manual summarisation approaches in the system.</w:t>
+      </w:r>
+    </w:p>
+    <w:p>
+      <w:pPr>
+        <w:numPr>
+          <w:ilvl w:val="0"/>
+          <w:numId w:val="3"/>
+        </w:numPr>
+        <w:spacing w:line="360" w:lineRule="auto"/>
+        <w:jc w:val="both"/>
+      </w:pPr>
+      <w:r>
+        <w:t>A comparison of tools and identifying the right tool for different parts of the job is entirely valid for the dissertation discussion.</w:t>
+      </w:r>
+    </w:p>
+    <w:p>
+      <w:pPr>
+        <w:numPr>
+          <w:ilvl w:val="0"/>
+          <w:numId w:val="3"/>
+        </w:numPr>
+        <w:spacing w:line="360" w:lineRule="auto"/>
+        <w:jc w:val="both"/>
+      </w:pPr>
+      <w:r>
+        <w:t>Key guidance: the comparison must be framed as a structured, deliberate experimental approach</w:t>
+      </w:r>
+      <w:r>
+        <w:t>,</w:t>
+      </w:r>
+      <w:r>
+        <w:t xml:space="preserve"> not presented as random experimentation.</w:t>
+      </w:r>
+    </w:p>
+    <w:p>
+      <w:pPr>
+        <w:numPr>
+          <w:ilvl w:val="0"/>
+          <w:numId w:val="3"/>
+        </w:numPr>
+        <w:spacing w:line="360" w:lineRule="auto"/>
+        <w:jc w:val="both"/>
+      </w:pPr>
+      <w:r>
+        <w:t>Need to</w:t>
+      </w:r>
+      <w:r>
+        <w:t xml:space="preserve"> articulate that tools were selected for specific reasons, enabling testing of </w:t>
+      </w:r>
+      <w:proofErr w:type="gramStart"/>
+      <w:r>
+        <w:t>particular hypotheses</w:t>
+      </w:r>
+      <w:proofErr w:type="gramEnd"/>
+      <w:r>
+        <w:t>, rather than appearing ad hoc.</w:t>
+      </w:r>
+    </w:p>
+    <w:p>
+      <w:pPr>
+        <w:spacing w:line="360" w:lineRule="auto"/>
+        <w:jc w:val="both"/>
+      </w:pPr>
+    </w:p>
+    <w:p>
+      <w:pPr>
+        <w:spacing w:line="360" w:lineRule="auto"/>
+        <w:jc w:val="both"/>
+      </w:pPr>
+      <w:r>
+        <w:rPr>
+          <w:b/>
+          <w:bCs/>
+          <w:u w:val="single"/>
+        </w:rPr>
+        <w:t>Action Points:</w:t>
+      </w:r>
+    </w:p>
+    <w:p>
+      <w:pPr>
+        <w:numPr>
+          <w:ilvl w:val="0"/>
+          <w:numId w:val="3"/>
+        </w:numPr>
+        <w:spacing w:line="360" w:lineRule="auto"/>
+        <w:jc w:val="both"/>
+      </w:pPr>
+      <w:r>
+        <w:t>Continue development on both AI summarisation approaches (Hugging Face and manual rule-based).</w:t>
+      </w:r>
+    </w:p>
+    <w:p>
+      <w:pPr>
+        <w:numPr>
+          <w:ilvl w:val="0"/>
+          <w:numId w:val="3"/>
+        </w:numPr>
+        <w:spacing w:line="360" w:lineRule="auto"/>
+        <w:jc w:val="both"/>
+      </w:pPr>
+      <w:r>
+        <w:lastRenderedPageBreak/>
+        <w:t>Frame the dual-approach as a deliberate experimental comparison in the dissertation – articulate why each tool was selected and what hypothesis each enables testing.</w:t>
+      </w:r>
+    </w:p>
+    <w:p>
+      <w:pPr>
+        <w:numPr>
+          <w:ilvl w:val="0"/>
+          <w:numId w:val="3"/>
+        </w:numPr>
+        <w:spacing w:line="360" w:lineRule="auto"/>
+        <w:jc w:val="both"/>
+      </w:pPr>
+      <w:r>
+        <w:t>Do not over-invest time in resolving Gemini access issues</w:t>
+      </w:r>
+      <w:r>
+        <w:t>.</w:t>
+      </w:r>
+    </w:p>
+    <w:p>
+      <w:pPr>
+        <w:numPr>
+          <w:ilvl w:val="0"/>
+          <w:numId w:val="3"/>
+        </w:numPr>
+        <w:spacing w:line="360" w:lineRule="auto"/>
+        <w:jc w:val="both"/>
+        <w:rPr>
+          <w:b/>
+          <w:bCs/>
+          <w:i/>
+          <w:iCs/>
+          <w:u w:val="single"/>
+        </w:rPr>
+      </w:pPr>
+      <w:r>
+        <w:rPr>
+          <w:b/>
+          <w:bCs/>
+          <w:i/>
+          <w:iCs/>
+          <w:u w:val="single"/>
+        </w:rPr>
+        <w:t>Ensure progress is being made across all three research questions</w:t>
+      </w:r>
+      <w:r>
+        <w:rPr>
+          <w:b/>
+          <w:bCs/>
+          <w:i/>
+          <w:iCs/>
+          <w:u w:val="single"/>
+        </w:rPr>
+        <w:t>,</w:t>
+      </w:r>
+      <w:r>
+        <w:rPr>
+          <w:b/>
+          <w:bCs/>
+          <w:i/>
+          <w:iCs/>
+          <w:u w:val="single"/>
+        </w:rPr>
+        <w:t xml:space="preserve"> avoid focusing exclusively on one area.</w:t>
+      </w:r>
+    </w:p>
+    <w:p>
+      <w:pPr>
+        <w:spacing w:line="360" w:lineRule="auto"/>
+        <w:jc w:val="both"/>
+      </w:pPr>
+    </w:p>
+    <w:p>
+      <w:pPr>
+        <w:spacing w:line="360" w:lineRule="auto"/>
+        <w:jc w:val="both"/>
+      </w:pPr>
+      <w:r>
+        <w:rPr>
+          <w:b/>
+          <w:bCs/>
+        </w:rPr>
+        <w:t xml:space="preserve">Date of next meeting: </w:t>
+      </w:r>
+      <w:r>
+        <w:t>19/03/2026</w:t>
+      </w:r>
+    </w:p>
+    <w:p>
+      <w:pPr>
+        <w:spacing w:line="360" w:lineRule="auto"/>
+        <w:jc w:val="both"/>
+      </w:pPr>
+    </w:p>
+    <w:p>
+      <w:pPr>
+        <w:spacing w:line="360" w:lineRule="auto"/>
+        <w:jc w:val="both"/>
+      </w:pPr>
+      <w:r>
+        <w:rPr>
+          <w:i/>
+          <w:iCs/>
+        </w:rPr>
+        <w:t>Agreed minutes should be initialled by the supervisor.</w:t>
+      </w:r>
+    </w:p>
+    <w:p>
+      <w:pPr>
+        <w:spacing w:line="360" w:lineRule="auto"/>
+        <w:jc w:val="both"/>
+      </w:pPr>
+      <w:r>
+        <w:rPr>
+          <w:b/>
+          <w:bCs/>
+        </w:rPr>
+        <w:t>Supervisor’s Initials:</w:t>
+      </w:r>
+      <w:r>
+        <w:t xml:space="preserve"> ___________ Date: ___________</w:t>
+      </w:r>
+    </w:p>
+    <w:p>
+      <w:pPr>
+        <w:spacing w:line="360" w:lineRule="auto"/>
+        <w:jc w:val="both"/>
+      </w:pPr>
+    </w:p>
+    <w:p>
+      <w:pPr>
+        <w:spacing w:line="360" w:lineRule="auto"/>
+        <w:jc w:val="both"/>
+        <w:rPr>
+          <w:b/>
+          <w:bCs/>
+          <w:u w:val="single"/>
+        </w:rPr>
+      </w:pPr>
+      <w:r>
+        <w:rPr>
+          <w:b/>
+          <w:bCs/>
+          <w:u w:val="single"/>
+        </w:rPr>
+        <w:t>Supervisor’s Comments:</w:t>
+      </w:r>
+    </w:p>
+    <w:p>
+      <w:pPr>
+        <w:spacing w:after="160" w:line="278" w:lineRule="auto"/>
+        <w:rPr>
+          <w:b/>
+          <w:bCs/>
+          <w:u w:val="single"/>
+        </w:rPr>
+      </w:pPr>
+      <w:r>
+        <w:rPr>
+          <w:b/>
+          <w:bCs/>
+          <w:u w:val="single"/>
+        </w:rPr>
+        <w:br w:type="page"/>
+      </w:r>
+    </w:p>
+    <w:p>
+      <w:pPr>
+        <w:spacing w:line="360" w:lineRule="auto"/>
+        <w:jc w:val="both"/>
+      </w:pPr>
+      <w:r>
+        <w:rPr>
+          <w:b/>
+          <w:bCs/>
+        </w:rPr>
+        <w:lastRenderedPageBreak/>
+        <w:t>QUEEN’S UNIVERSITY OF BELFAST COMPUTER SCIENCE</w:t>
+      </w:r>
+    </w:p>
+    <w:p>
+      <w:pPr>
+        <w:spacing w:line="360" w:lineRule="auto"/>
+        <w:jc w:val="both"/>
+      </w:pPr>
+      <w:r>
+        <w:rPr>
+          <w:b/>
+          <w:bCs/>
+        </w:rPr>
+        <w:t>Minutes of Project Supervision Meeting</w:t>
+      </w:r>
+    </w:p>
+    <w:p>
+      <w:pPr>
+        <w:spacing w:line="360" w:lineRule="auto"/>
+        <w:jc w:val="both"/>
+      </w:pPr>
+      <w:r>
+        <w:rPr>
+          <w:b/>
+          <w:bCs/>
+        </w:rPr>
+        <w:t xml:space="preserve">Student Name: </w:t>
+      </w:r>
+      <w:r>
+        <w:t>Gabriella Keisha Andini</w:t>
+      </w:r>
+    </w:p>
+    <w:p>
+      <w:pPr>
+        <w:spacing w:line="360" w:lineRule="auto"/>
+        <w:jc w:val="both"/>
+      </w:pPr>
+      <w:r>
+        <w:rPr>
+          <w:b/>
+          <w:bCs/>
+        </w:rPr>
+        <w:t xml:space="preserve">Project Module Code: </w:t>
+      </w:r>
+      <w:r>
+        <w:t>CSC3002</w:t>
+      </w:r>
+    </w:p>
+    <w:p>
+      <w:pPr>
+        <w:spacing w:line="360" w:lineRule="auto"/>
+        <w:jc w:val="both"/>
+      </w:pPr>
+      <w:r>
+        <w:rPr>
+          <w:b/>
+          <w:bCs/>
+        </w:rPr>
+        <w:t xml:space="preserve">Project Supervisor: </w:t>
+      </w:r>
+      <w:r>
+        <w:t>Andrew McDowell</w:t>
+      </w:r>
+    </w:p>
+    <w:p>
+      <w:pPr>
+        <w:spacing w:line="360" w:lineRule="auto"/>
+        <w:jc w:val="both"/>
+      </w:pPr>
+      <w:r>
+        <w:rPr>
+          <w:b/>
+          <w:bCs/>
+        </w:rPr>
+        <w:t xml:space="preserve">Meeting Number: </w:t>
+      </w:r>
+      <w:r>
+        <w:t>18</w:t>
+      </w:r>
+    </w:p>
+    <w:p>
+      <w:pPr>
+        <w:spacing w:line="360" w:lineRule="auto"/>
+        <w:jc w:val="both"/>
+      </w:pPr>
+      <w:r>
+        <w:rPr>
+          <w:b/>
+          <w:bCs/>
+        </w:rPr>
+        <w:t xml:space="preserve">Date of Meeting: </w:t>
+      </w:r>
+      <w:r>
+        <w:t>19/03/2026</w:t>
+      </w:r>
+    </w:p>
+    <w:p>
+      <w:pPr>
+        <w:spacing w:line="360" w:lineRule="auto"/>
+        <w:jc w:val="both"/>
+      </w:pPr>
+    </w:p>
+    <w:p>
+      <w:pPr>
+        <w:spacing w:line="360" w:lineRule="auto"/>
+        <w:jc w:val="both"/>
+      </w:pPr>
+      <w:r>
+        <w:rPr>
+          <w:b/>
+          <w:bCs/>
+          <w:u w:val="single"/>
+        </w:rPr>
+        <w:t>Progress since the last meeting, and decisions arrived at during the meeting:</w:t>
+      </w:r>
+    </w:p>
+    <w:p>
+      <w:pPr>
+        <w:spacing w:line="360" w:lineRule="auto"/>
+        <w:jc w:val="both"/>
+      </w:pPr>
+      <w:r>
+        <w:rPr>
+          <w:b/>
+          <w:bCs/>
+        </w:rPr>
+        <w:t>AI Integration Update:</w:t>
+      </w:r>
+    </w:p>
+    <w:p>
+      <w:pPr>
+        <w:numPr>
+          <w:ilvl w:val="0"/>
+          <w:numId w:val="4"/>
+        </w:numPr>
+        <w:spacing w:line="360" w:lineRule="auto"/>
+        <w:jc w:val="both"/>
+      </w:pPr>
+      <w:r>
+        <w:t>Gemini integration abandoned due to persistent access and billing issues; confirmed not viable for this project.</w:t>
+      </w:r>
+    </w:p>
+    <w:p>
+      <w:pPr>
+        <w:numPr>
+          <w:ilvl w:val="0"/>
+          <w:numId w:val="4"/>
+        </w:numPr>
+        <w:spacing w:line="360" w:lineRule="auto"/>
+        <w:jc w:val="both"/>
+      </w:pPr>
+      <w:r>
+        <w:t>Two AI summarisation approaches retained for comparison: Hugging Face model and RAKE-based rule-based keyword extraction.</w:t>
+      </w:r>
+    </w:p>
+    <w:p>
+      <w:pPr>
+        <w:spacing w:line="360" w:lineRule="auto"/>
+        <w:jc w:val="both"/>
+      </w:pPr>
+      <w:r>
+        <w:rPr>
+          <w:b/>
+          <w:bCs/>
+        </w:rPr>
+        <w:t>Testing Progress:</w:t>
+      </w:r>
+    </w:p>
+    <w:p>
+      <w:pPr>
+        <w:numPr>
+          <w:ilvl w:val="0"/>
+          <w:numId w:val="4"/>
+        </w:numPr>
+        <w:spacing w:line="360" w:lineRule="auto"/>
+        <w:jc w:val="both"/>
+      </w:pPr>
+      <w:r>
+        <w:t>Created automated test scripts covering security testing, authorisation rules, middleware, and AI services.</w:t>
+      </w:r>
+    </w:p>
+    <w:p>
+      <w:pPr>
+        <w:spacing w:line="360" w:lineRule="auto"/>
+        <w:jc w:val="both"/>
+      </w:pPr>
+      <w:r>
+        <w:rPr>
+          <w:b/>
+          <w:bCs/>
+        </w:rPr>
+        <w:t>Dissertation Writing:</w:t>
+      </w:r>
+    </w:p>
+    <w:p>
+      <w:pPr>
+        <w:numPr>
+          <w:ilvl w:val="0"/>
+          <w:numId w:val="4"/>
+        </w:numPr>
+        <w:spacing w:line="360" w:lineRule="auto"/>
+        <w:jc w:val="both"/>
+      </w:pPr>
+      <w:r>
+        <w:t>Begun rough draft of the dissertation; still at an early stage.</w:t>
+      </w:r>
+    </w:p>
+    <w:p>
+      <w:pPr>
+        <w:numPr>
+          <w:ilvl w:val="0"/>
+          <w:numId w:val="4"/>
+        </w:numPr>
+        <w:spacing w:line="360" w:lineRule="auto"/>
+        <w:jc w:val="both"/>
+      </w:pPr>
+      <w:r>
+        <w:t>P</w:t>
+      </w:r>
+      <w:r>
+        <w:t>roposed dedicating the next meeting to a detailed walkthrough of the dissertation outline and structure.</w:t>
+      </w:r>
+    </w:p>
+    <w:p>
+      <w:pPr>
+        <w:spacing w:line="360" w:lineRule="auto"/>
+        <w:jc w:val="both"/>
+      </w:pPr>
+      <w:r>
+        <w:rPr>
+          <w:b/>
+          <w:bCs/>
+        </w:rPr>
+        <w:t>Research Question 1 – Anonymity:</w:t>
+      </w:r>
+    </w:p>
+    <w:p>
+      <w:pPr>
+        <w:numPr>
+          <w:ilvl w:val="0"/>
+          <w:numId w:val="4"/>
+        </w:numPr>
+        <w:spacing w:line="360" w:lineRule="auto"/>
+        <w:jc w:val="both"/>
+      </w:pPr>
+      <w:r>
+        <w:t>Plans</w:t>
+      </w:r>
+      <w:r>
+        <w:t xml:space="preserve"> to address RQ1 by referencing the implemented anonymity options (anonymous, pseudonymous, identified) and supporting the discussion with published literature rather than live user testing.</w:t>
+      </w:r>
+    </w:p>
+    <w:p>
+      <w:pPr>
+        <w:numPr>
+          <w:ilvl w:val="0"/>
+          <w:numId w:val="4"/>
+        </w:numPr>
+        <w:spacing w:line="360" w:lineRule="auto"/>
+        <w:jc w:val="both"/>
+      </w:pPr>
+      <w:r>
+        <w:t xml:space="preserve">Advised </w:t>
+      </w:r>
+      <w:r>
+        <w:t>going a level deeper: compare the specific implementation of pseudonymity mode and how users shift between identity modes against other published implementations.</w:t>
+      </w:r>
+    </w:p>
+    <w:p>
+      <w:pPr>
+        <w:numPr>
+          <w:ilvl w:val="0"/>
+          <w:numId w:val="4"/>
+        </w:numPr>
+        <w:spacing w:line="360" w:lineRule="auto"/>
+        <w:jc w:val="both"/>
+      </w:pPr>
+      <w:r>
+        <w:t>Frame the discussion around whether the implementation represents a development or enhancement of existing approaches to anonymity in backchannel systems.</w:t>
+      </w:r>
+    </w:p>
+    <w:p>
+      <w:pPr>
+        <w:spacing w:line="360" w:lineRule="auto"/>
+        <w:jc w:val="both"/>
+      </w:pPr>
+      <w:r>
+        <w:rPr>
+          <w:b/>
+          <w:bCs/>
+        </w:rPr>
+        <w:t>Testing Expectations Clarified:</w:t>
+      </w:r>
+    </w:p>
+    <w:p>
+      <w:pPr>
+        <w:numPr>
+          <w:ilvl w:val="0"/>
+          <w:numId w:val="4"/>
+        </w:numPr>
+        <w:spacing w:line="360" w:lineRule="auto"/>
+        <w:jc w:val="both"/>
+      </w:pPr>
+      <w:r>
+        <w:t>Standard automated tests (component, integration, and system-level) should be in place for critical areas.</w:t>
+      </w:r>
+    </w:p>
+    <w:p>
+      <w:pPr>
+        <w:numPr>
+          <w:ilvl w:val="0"/>
+          <w:numId w:val="4"/>
+        </w:numPr>
+        <w:spacing w:line="360" w:lineRule="auto"/>
+        <w:jc w:val="both"/>
+      </w:pPr>
+      <w:r>
+        <w:t>User experience testing is important given that students will likely use the chat on mobile devices.</w:t>
+      </w:r>
+    </w:p>
+    <w:p>
+      <w:pPr>
+        <w:numPr>
+          <w:ilvl w:val="0"/>
+          <w:numId w:val="4"/>
+        </w:numPr>
+        <w:spacing w:line="360" w:lineRule="auto"/>
+        <w:jc w:val="both"/>
+      </w:pPr>
+      <w:r>
+        <w:lastRenderedPageBreak/>
+        <w:t>Recommended</w:t>
+      </w:r>
+      <w:r>
+        <w:t xml:space="preserve"> session-based testing (SBT) as a lightweight approach suitable for systems-level and UX testing.</w:t>
+      </w:r>
+    </w:p>
+    <w:p>
+      <w:pPr>
+        <w:numPr>
+          <w:ilvl w:val="0"/>
+          <w:numId w:val="4"/>
+        </w:numPr>
+        <w:spacing w:line="360" w:lineRule="auto"/>
+        <w:jc w:val="both"/>
+      </w:pPr>
+      <w:r>
+        <w:t>Testing rigour should be reasonable, not exhaustive – the system is an experimental harness, not a production application.</w:t>
+      </w:r>
+    </w:p>
+    <w:p>
+      <w:pPr>
+        <w:spacing w:line="360" w:lineRule="auto"/>
+        <w:jc w:val="both"/>
+      </w:pPr>
+      <w:r>
+        <w:rPr>
+          <w:b/>
+          <w:bCs/>
+        </w:rPr>
+        <w:t>AI Summarisation – Experimental Approach:</w:t>
+      </w:r>
+    </w:p>
+    <w:p>
+      <w:pPr>
+        <w:numPr>
+          <w:ilvl w:val="0"/>
+          <w:numId w:val="4"/>
+        </w:numPr>
+        <w:spacing w:line="360" w:lineRule="auto"/>
+        <w:jc w:val="both"/>
+      </w:pPr>
+      <w:r>
+        <w:t>Advised</w:t>
+      </w:r>
+      <w:r>
+        <w:t xml:space="preserve"> focusing on the accuracy and relevance of each AI model’s output relative to the actual chat content.</w:t>
+      </w:r>
+    </w:p>
+    <w:p>
+      <w:pPr>
+        <w:numPr>
+          <w:ilvl w:val="0"/>
+          <w:numId w:val="4"/>
+        </w:numPr>
+        <w:spacing w:line="360" w:lineRule="auto"/>
+        <w:jc w:val="both"/>
+      </w:pPr>
+      <w:r>
+        <w:t>Recommended generating simulated chat data biased towards specific themes (e.g., confusion about a topic) and testing which model best captures the key concerns.</w:t>
+      </w:r>
+    </w:p>
+    <w:p>
+      <w:pPr>
+        <w:numPr>
+          <w:ilvl w:val="0"/>
+          <w:numId w:val="4"/>
+        </w:numPr>
+        <w:spacing w:line="360" w:lineRule="auto"/>
+        <w:jc w:val="both"/>
+      </w:pPr>
+      <w:r>
+        <w:t xml:space="preserve">Suggested running approximately half a dozen experiments across different message frequencies and themes to </w:t>
+      </w:r>
+      <w:r>
+        <w:t>compare</w:t>
+      </w:r>
+      <w:r>
+        <w:t xml:space="preserve"> model utility.</w:t>
+      </w:r>
+    </w:p>
+    <w:p>
+      <w:pPr>
+        <w:numPr>
+          <w:ilvl w:val="0"/>
+          <w:numId w:val="4"/>
+        </w:numPr>
+        <w:spacing w:line="360" w:lineRule="auto"/>
+        <w:jc w:val="both"/>
+      </w:pPr>
+      <w:r>
+        <w:t>Discussion points for the dissertation: self-hosted model (training opportunity, data privacy) vs. general-purpose AI (larger language model, broader capability), plus cost, implementation effort, and data governance considerations.</w:t>
+      </w:r>
+    </w:p>
+    <w:p>
+      <w:pPr>
+        <w:numPr>
+          <w:ilvl w:val="0"/>
+          <w:numId w:val="4"/>
+        </w:numPr>
+        <w:spacing w:line="360" w:lineRule="auto"/>
+        <w:jc w:val="both"/>
+      </w:pPr>
+      <w:r>
+        <w:t>Both models should be retained in the system with a configuration toggle to switch between them for testing purposes.</w:t>
+      </w:r>
+    </w:p>
+    <w:p>
+      <w:pPr>
+        <w:spacing w:line="360" w:lineRule="auto"/>
+        <w:jc w:val="both"/>
+      </w:pPr>
+      <w:r>
+        <w:rPr>
+          <w:b/>
+          <w:bCs/>
+        </w:rPr>
+        <w:t>Final Demonstration Format:</w:t>
+      </w:r>
+    </w:p>
+    <w:p>
+      <w:pPr>
+        <w:numPr>
+          <w:ilvl w:val="0"/>
+          <w:numId w:val="4"/>
+        </w:numPr>
+        <w:spacing w:line="360" w:lineRule="auto"/>
+        <w:jc w:val="both"/>
+      </w:pPr>
+      <w:r>
+        <w:t>Session duration: 30 minutes total</w:t>
+      </w:r>
+      <w:r>
+        <w:t xml:space="preserve">: </w:t>
+      </w:r>
+      <w:r>
+        <w:t>approximately 10–12 minutes for student demonstration, followed by 5–10 minutes of Q&amp;A.</w:t>
+      </w:r>
+    </w:p>
+    <w:p>
+      <w:pPr>
+        <w:numPr>
+          <w:ilvl w:val="0"/>
+          <w:numId w:val="4"/>
+        </w:numPr>
+        <w:spacing w:line="360" w:lineRule="auto"/>
+        <w:jc w:val="both"/>
+      </w:pPr>
+      <w:r>
+        <w:t>Demonstration should cover the MVP and highlight technically impressive features (“shiny bits”).</w:t>
+      </w:r>
+    </w:p>
+    <w:p>
+      <w:pPr>
+        <w:numPr>
+          <w:ilvl w:val="0"/>
+          <w:numId w:val="4"/>
+        </w:numPr>
+        <w:spacing w:line="360" w:lineRule="auto"/>
+        <w:jc w:val="both"/>
+      </w:pPr>
+      <w:r>
+        <w:t>Presentation should be carefully scripted and practised</w:t>
+      </w:r>
+      <w:r>
+        <w:t xml:space="preserve">, </w:t>
+      </w:r>
+      <w:r>
+        <w:t>not a code walkthrough, but a live system demonstration.</w:t>
+      </w:r>
+    </w:p>
+    <w:p>
+      <w:pPr>
+        <w:numPr>
+          <w:ilvl w:val="0"/>
+          <w:numId w:val="4"/>
+        </w:numPr>
+        <w:spacing w:line="360" w:lineRule="auto"/>
+        <w:jc w:val="both"/>
+      </w:pPr>
+      <w:r>
+        <w:t>Q&amp;A will be led by the second assessor (who is new to the project), followed by questions from the supervisor.</w:t>
+      </w:r>
+    </w:p>
+    <w:p>
+      <w:pPr>
+        <w:numPr>
+          <w:ilvl w:val="0"/>
+          <w:numId w:val="4"/>
+        </w:numPr>
+        <w:spacing w:line="360" w:lineRule="auto"/>
+        <w:jc w:val="both"/>
+      </w:pPr>
+      <w:r>
+        <w:t>Questions aim to understand the current state of the project and may explore areas not yet completed.</w:t>
+      </w:r>
+    </w:p>
+    <w:p>
+      <w:pPr>
+        <w:numPr>
+          <w:ilvl w:val="0"/>
+          <w:numId w:val="4"/>
+        </w:numPr>
+        <w:spacing w:line="360" w:lineRule="auto"/>
+        <w:jc w:val="both"/>
+      </w:pPr>
+      <w:r>
+        <w:t>Demo date will be scheduled separately from the submission deadline, typically within 1–2 weeks after submission. Dates will be coordinated once the second assessor is confirmed.</w:t>
+      </w:r>
+    </w:p>
+    <w:p>
+      <w:pPr>
+        <w:spacing w:line="360" w:lineRule="auto"/>
+        <w:jc w:val="both"/>
+      </w:pPr>
+    </w:p>
+    <w:p>
+      <w:pPr>
+        <w:spacing w:line="360" w:lineRule="auto"/>
+        <w:jc w:val="both"/>
+      </w:pPr>
+      <w:r>
+        <w:rPr>
+          <w:b/>
+          <w:bCs/>
+          <w:u w:val="single"/>
+        </w:rPr>
+        <w:t>Action Points:</w:t>
+      </w:r>
+    </w:p>
+    <w:p>
+      <w:pPr>
+        <w:numPr>
+          <w:ilvl w:val="0"/>
+          <w:numId w:val="4"/>
+        </w:numPr>
+        <w:spacing w:line="360" w:lineRule="auto"/>
+        <w:jc w:val="both"/>
+      </w:pPr>
+      <w:r>
+        <w:t>Round out remaining development work over the next week.</w:t>
+      </w:r>
+    </w:p>
+    <w:p>
+      <w:pPr>
+        <w:numPr>
+          <w:ilvl w:val="0"/>
+          <w:numId w:val="4"/>
+        </w:numPr>
+        <w:spacing w:line="360" w:lineRule="auto"/>
+        <w:jc w:val="both"/>
+      </w:pPr>
+      <w:r>
+        <w:t>Prepare a dissertation outline for the next meeting: list all chapters/headings from the handbook, add sub-headings and a sentence or two on planned content for each section.</w:t>
+      </w:r>
+    </w:p>
+    <w:p>
+      <w:pPr>
+        <w:numPr>
+          <w:ilvl w:val="0"/>
+          <w:numId w:val="4"/>
+        </w:numPr>
+        <w:spacing w:line="360" w:lineRule="auto"/>
+        <w:jc w:val="both"/>
+      </w:pPr>
+      <w:r>
+        <w:lastRenderedPageBreak/>
+        <w:t>Continue AI summarisation comparison experiments using simulated chat data with varied themes and message frequencies.</w:t>
+      </w:r>
+    </w:p>
+    <w:p>
+      <w:pPr>
+        <w:numPr>
+          <w:ilvl w:val="0"/>
+          <w:numId w:val="4"/>
+        </w:numPr>
+        <w:spacing w:line="360" w:lineRule="auto"/>
+        <w:jc w:val="both"/>
+      </w:pPr>
+      <w:r>
+        <w:t>Implement a configuration toggle to switch between Hugging Face and RAKE summarisation models.</w:t>
+      </w:r>
+    </w:p>
+    <w:p>
+      <w:pPr>
+        <w:numPr>
+          <w:ilvl w:val="0"/>
+          <w:numId w:val="4"/>
+        </w:numPr>
+        <w:spacing w:line="360" w:lineRule="auto"/>
+        <w:jc w:val="both"/>
+      </w:pPr>
+      <w:r>
+        <w:t>Research session-based testing (SBT) and consider applying it for UX and systems-level testing.</w:t>
+      </w:r>
+    </w:p>
+    <w:p>
+      <w:pPr>
+        <w:numPr>
+          <w:ilvl w:val="0"/>
+          <w:numId w:val="4"/>
+        </w:numPr>
+        <w:spacing w:line="360" w:lineRule="auto"/>
+        <w:jc w:val="both"/>
+      </w:pPr>
+      <w:r>
+        <w:t>Deepen RQ1 anonymity discussion: compare implementation against published pseudonymity approaches and frame as enhancement/development.</w:t>
+      </w:r>
+    </w:p>
+    <w:p>
+      <w:pPr>
+        <w:spacing w:line="360" w:lineRule="auto"/>
+        <w:jc w:val="both"/>
+      </w:pPr>
+    </w:p>
+    <w:p>
+      <w:pPr>
+        <w:spacing w:line="360" w:lineRule="auto"/>
+        <w:jc w:val="both"/>
+      </w:pPr>
+      <w:r>
+        <w:rPr>
+          <w:b/>
+          <w:bCs/>
+        </w:rPr>
+        <w:t xml:space="preserve">Date of next meeting: </w:t>
+      </w:r>
+      <w:r>
+        <w:t>26/03/2026 (12.30)</w:t>
+      </w:r>
+    </w:p>
+    <w:p>
+      <w:pPr>
+        <w:spacing w:line="360" w:lineRule="auto"/>
+        <w:jc w:val="both"/>
+      </w:pPr>
+    </w:p>
+    <w:p>
+      <w:pPr>
+        <w:spacing w:line="360" w:lineRule="auto"/>
+        <w:jc w:val="both"/>
+      </w:pPr>
+      <w:r>
+        <w:rPr>
+          <w:i/>
+          <w:iCs/>
+        </w:rPr>
+        <w:t>Agreed minutes should be initialled by the supervisor.</w:t>
+      </w:r>
+    </w:p>
+    <w:p>
+      <w:pPr>
+        <w:spacing w:line="360" w:lineRule="auto"/>
+        <w:jc w:val="both"/>
+      </w:pPr>
+      <w:r>
+        <w:rPr>
+          <w:b/>
+          <w:bCs/>
+        </w:rPr>
+        <w:t>Supervisor’s Initials:</w:t>
+      </w:r>
+      <w:r>
+        <w:t xml:space="preserve"> ___________ Date: ___________</w:t>
+      </w:r>
+    </w:p>
+    <w:p>
+      <w:pPr>
+        <w:spacing w:line="360" w:lineRule="auto"/>
+        <w:jc w:val="both"/>
+      </w:pPr>
+    </w:p>
+    <w:p>
+      <w:pPr>
+        <w:spacing w:line="360" w:lineRule="auto"/>
+        <w:jc w:val="both"/>
+      </w:pPr>
+      <w:r>
+        <w:rPr>
+          <w:b/>
+          <w:bCs/>
+          <w:u w:val="single"/>
+        </w:rPr>
+        <w:t>Supervisor’s Comments:</w:t>
+      </w:r>
+    </w:p>
+    <w:p>
+      <w:pPr>
+        <w:spacing w:line="360" w:lineRule="auto"/>
+        <w:jc w:val="both"/>
+      </w:pPr>
+    </w:p>
+    <w:p>
+      <w:pPr>
+        <w:spacing w:line="360" w:lineRule="auto"/>
+        <w:jc w:val="both"/>
+      </w:pPr>
+    </w:p>
+    <w:p>
+      <w:pPr>
+        <w:spacing w:line="360" w:lineRule="auto"/>
+        <w:jc w:val="both"/>
+      </w:pPr>
+    </w:p>
+    <w:p>
+      <w:pPr>
+        <w:spacing w:line="360" w:lineRule="auto"/>
+        <w:jc w:val="both"/>
+      </w:pPr>
     </w:p>
     <w:p>
       <w:pPr>
@@ -2322,6 +3618,120 @@
     </w:lvl>
   </w:abstractNum>
   <w:abstractNum w:abstractNumId="1" w15:restartNumberingAfterBreak="0">
+    <w:nsid w:val="17ED0811"/>
+    <w:multiLevelType w:val="hybridMultilevel"/>
+    <w:tmpl w:val="5BB465E6"/>
+    <w:lvl w:ilvl="0" w:tplc="88B2BD96">
+      <w:start w:val="1"/>
+      <w:numFmt w:val="bullet"/>
+      <w:lvlText w:val="•"/>
+      <w:lvlJc w:val="left"/>
+      <w:pPr>
+        <w:ind w:left="720" w:hanging="360"/>
+      </w:pPr>
+      <w:rPr>
+        <w:rFonts w:ascii="Symbol" w:eastAsia="Symbol" w:hAnsi="Symbol" w:cs="Symbol"/>
+      </w:rPr>
+    </w:lvl>
+    <w:lvl w:ilvl="1" w:tplc="98D0D23C">
+      <w:numFmt w:val="decimal"/>
+      <w:lvlText w:val=""/>
+      <w:lvlJc w:val="left"/>
+    </w:lvl>
+    <w:lvl w:ilvl="2" w:tplc="012A2960">
+      <w:numFmt w:val="decimal"/>
+      <w:lvlText w:val=""/>
+      <w:lvlJc w:val="left"/>
+    </w:lvl>
+    <w:lvl w:ilvl="3" w:tplc="AE12938A">
+      <w:numFmt w:val="decimal"/>
+      <w:lvlText w:val=""/>
+      <w:lvlJc w:val="left"/>
+    </w:lvl>
+    <w:lvl w:ilvl="4" w:tplc="B89E137C">
+      <w:numFmt w:val="decimal"/>
+      <w:lvlText w:val=""/>
+      <w:lvlJc w:val="left"/>
+    </w:lvl>
+    <w:lvl w:ilvl="5" w:tplc="F336E0A8">
+      <w:numFmt w:val="decimal"/>
+      <w:lvlText w:val=""/>
+      <w:lvlJc w:val="left"/>
+    </w:lvl>
+    <w:lvl w:ilvl="6" w:tplc="31A6F2F0">
+      <w:numFmt w:val="decimal"/>
+      <w:lvlText w:val=""/>
+      <w:lvlJc w:val="left"/>
+    </w:lvl>
+    <w:lvl w:ilvl="7" w:tplc="90CC7FD4">
+      <w:numFmt w:val="decimal"/>
+      <w:lvlText w:val=""/>
+      <w:lvlJc w:val="left"/>
+    </w:lvl>
+    <w:lvl w:ilvl="8" w:tplc="7E24B3C8">
+      <w:numFmt w:val="decimal"/>
+      <w:lvlText w:val=""/>
+      <w:lvlJc w:val="left"/>
+    </w:lvl>
+  </w:abstractNum>
+  <w:abstractNum w:abstractNumId="2" w15:restartNumberingAfterBreak="0">
+    <w:nsid w:val="1B803763"/>
+    <w:multiLevelType w:val="hybridMultilevel"/>
+    <w:tmpl w:val="1B063F92"/>
+    <w:lvl w:ilvl="0" w:tplc="41A01946">
+      <w:start w:val="1"/>
+      <w:numFmt w:val="bullet"/>
+      <w:lvlText w:val="•"/>
+      <w:lvlJc w:val="left"/>
+      <w:pPr>
+        <w:ind w:left="720" w:hanging="360"/>
+      </w:pPr>
+      <w:rPr>
+        <w:rFonts w:ascii="Symbol" w:eastAsia="Symbol" w:hAnsi="Symbol" w:cs="Symbol"/>
+      </w:rPr>
+    </w:lvl>
+    <w:lvl w:ilvl="1" w:tplc="E8BE6E04">
+      <w:numFmt w:val="decimal"/>
+      <w:lvlText w:val=""/>
+      <w:lvlJc w:val="left"/>
+    </w:lvl>
+    <w:lvl w:ilvl="2" w:tplc="01C070CE">
+      <w:numFmt w:val="decimal"/>
+      <w:lvlText w:val=""/>
+      <w:lvlJc w:val="left"/>
+    </w:lvl>
+    <w:lvl w:ilvl="3" w:tplc="13F61224">
+      <w:numFmt w:val="decimal"/>
+      <w:lvlText w:val=""/>
+      <w:lvlJc w:val="left"/>
+    </w:lvl>
+    <w:lvl w:ilvl="4" w:tplc="332ECAA0">
+      <w:numFmt w:val="decimal"/>
+      <w:lvlText w:val=""/>
+      <w:lvlJc w:val="left"/>
+    </w:lvl>
+    <w:lvl w:ilvl="5" w:tplc="F8B850C4">
+      <w:numFmt w:val="decimal"/>
+      <w:lvlText w:val=""/>
+      <w:lvlJc w:val="left"/>
+    </w:lvl>
+    <w:lvl w:ilvl="6" w:tplc="FCBC85F0">
+      <w:numFmt w:val="decimal"/>
+      <w:lvlText w:val=""/>
+      <w:lvlJc w:val="left"/>
+    </w:lvl>
+    <w:lvl w:ilvl="7" w:tplc="AB92899C">
+      <w:numFmt w:val="decimal"/>
+      <w:lvlText w:val=""/>
+      <w:lvlJc w:val="left"/>
+    </w:lvl>
+    <w:lvl w:ilvl="8" w:tplc="8B0CEC1E">
+      <w:numFmt w:val="decimal"/>
+      <w:lvlText w:val=""/>
+      <w:lvlJc w:val="left"/>
+    </w:lvl>
+  </w:abstractNum>
+  <w:abstractNum w:abstractNumId="3" w15:restartNumberingAfterBreak="0">
     <w:nsid w:val="1CA40142"/>
     <w:multiLevelType w:val="hybridMultilevel"/>
     <w:tmpl w:val="DDD6F248"/>
@@ -2376,13 +3786,25 @@
     </w:lvl>
   </w:abstractNum>
   <w:num w:numId="1" w16cid:durableId="1017578605">
-    <w:abstractNumId w:val="1"/>
+    <w:abstractNumId w:val="3"/>
     <w:lvlOverride w:ilvl="0">
       <w:startOverride w:val="1"/>
     </w:lvlOverride>
   </w:num>
   <w:num w:numId="2" w16cid:durableId="1726483715">
     <w:abstractNumId w:val="0"/>
+    <w:lvlOverride w:ilvl="0">
+      <w:startOverride w:val="1"/>
+    </w:lvlOverride>
+  </w:num>
+  <w:num w:numId="3" w16cid:durableId="1706252129">
+    <w:abstractNumId w:val="2"/>
+    <w:lvlOverride w:ilvl="0">
+      <w:startOverride w:val="1"/>
+    </w:lvlOverride>
+  </w:num>
+  <w:num w:numId="4" w16cid:durableId="951204816">
+    <w:abstractNumId w:val="1"/>
     <w:lvlOverride w:ilvl="0">
       <w:startOverride w:val="1"/>
     </w:lvlOverride>

</xml_diff>

<commit_message>
update readme, refine test
</commit_message>
<xml_diff>
--- a/docs/MinutesofProjectMeetings_Feb26-Apr26.docx
+++ b/docs/MinutesofProjectMeetings_Feb26-Apr26.docx
@@ -3187,13 +3187,7 @@
         <w:jc w:val="both"/>
       </w:pPr>
       <w:r>
-        <w:t xml:space="preserve">Suggested running approximately half a dozen experiments across different message frequencies and themes to </w:t>
-      </w:r>
-      <w:r>
-        <w:t>compare</w:t>
-      </w:r>
-      <w:r>
-        <w:t xml:space="preserve"> model utility.</w:t>
+        <w:t>Suggested running approximately half a dozen experiments across different message frequencies and themes to compare model utility.</w:t>
       </w:r>
     </w:p>
     <w:p>
@@ -3491,27 +3485,1713 @@
       <w:pPr>
         <w:spacing w:line="360" w:lineRule="auto"/>
         <w:jc w:val="both"/>
-      </w:pPr>
-      <w:r>
         <w:rPr>
           <w:b/>
           <w:bCs/>
           <w:u w:val="single"/>
         </w:rPr>
+      </w:pPr>
+      <w:r>
+        <w:rPr>
+          <w:b/>
+          <w:bCs/>
+          <w:u w:val="single"/>
+        </w:rPr>
         <w:t>Supervisor’s Comments:</w:t>
       </w:r>
     </w:p>
     <w:p>
       <w:pPr>
-        <w:spacing w:line="360" w:lineRule="auto"/>
-        <w:jc w:val="both"/>
-      </w:pPr>
-    </w:p>
-    <w:p>
-      <w:pPr>
-        <w:spacing w:line="360" w:lineRule="auto"/>
-        <w:jc w:val="both"/>
-      </w:pPr>
+        <w:spacing w:after="160" w:line="278" w:lineRule="auto"/>
+        <w:rPr>
+          <w:b/>
+          <w:bCs/>
+          <w:u w:val="single"/>
+        </w:rPr>
+      </w:pPr>
+      <w:r>
+        <w:rPr>
+          <w:b/>
+          <w:bCs/>
+          <w:u w:val="single"/>
+        </w:rPr>
+        <w:br w:type="page"/>
+      </w:r>
+    </w:p>
+    <w:p>
+      <w:pPr>
+        <w:spacing w:line="360" w:lineRule="auto"/>
+        <w:jc w:val="both"/>
+      </w:pPr>
+      <w:r>
+        <w:rPr>
+          <w:b/>
+          <w:bCs/>
+        </w:rPr>
+        <w:lastRenderedPageBreak/>
+        <w:t>QUEEN’S UNIVERSITY OF BELFAST COMPUTER SCIENCE</w:t>
+      </w:r>
+    </w:p>
+    <w:p>
+      <w:pPr>
+        <w:spacing w:line="360" w:lineRule="auto"/>
+        <w:jc w:val="both"/>
+      </w:pPr>
+      <w:r>
+        <w:rPr>
+          <w:b/>
+          <w:bCs/>
+        </w:rPr>
+        <w:t>Minutes of Project Supervision Meeting</w:t>
+      </w:r>
+    </w:p>
+    <w:p>
+      <w:pPr>
+        <w:spacing w:line="360" w:lineRule="auto"/>
+        <w:jc w:val="both"/>
+      </w:pPr>
+      <w:r>
+        <w:rPr>
+          <w:b/>
+          <w:bCs/>
+        </w:rPr>
+        <w:t xml:space="preserve">Student Name: </w:t>
+      </w:r>
+      <w:r>
+        <w:t>Gabriella Keisha Andini</w:t>
+      </w:r>
+    </w:p>
+    <w:p>
+      <w:pPr>
+        <w:spacing w:line="360" w:lineRule="auto"/>
+        <w:jc w:val="both"/>
+      </w:pPr>
+      <w:r>
+        <w:rPr>
+          <w:b/>
+          <w:bCs/>
+        </w:rPr>
+        <w:t xml:space="preserve">Project Module Code: </w:t>
+      </w:r>
+      <w:r>
+        <w:t>CSC3002</w:t>
+      </w:r>
+    </w:p>
+    <w:p>
+      <w:pPr>
+        <w:spacing w:line="360" w:lineRule="auto"/>
+        <w:jc w:val="both"/>
+      </w:pPr>
+      <w:r>
+        <w:rPr>
+          <w:b/>
+          <w:bCs/>
+        </w:rPr>
+        <w:t xml:space="preserve">Project Supervisor: </w:t>
+      </w:r>
+      <w:r>
+        <w:t>Andrew McDowell</w:t>
+      </w:r>
+    </w:p>
+    <w:p>
+      <w:pPr>
+        <w:spacing w:line="360" w:lineRule="auto"/>
+        <w:jc w:val="both"/>
+      </w:pPr>
+      <w:r>
+        <w:rPr>
+          <w:b/>
+          <w:bCs/>
+        </w:rPr>
+        <w:t xml:space="preserve">Meeting Number: </w:t>
+      </w:r>
+      <w:r>
+        <w:t>19</w:t>
+      </w:r>
+    </w:p>
+    <w:p>
+      <w:pPr>
+        <w:spacing w:line="360" w:lineRule="auto"/>
+        <w:jc w:val="both"/>
+      </w:pPr>
+      <w:r>
+        <w:rPr>
+          <w:b/>
+          <w:bCs/>
+        </w:rPr>
+        <w:t xml:space="preserve">Date of Meeting: </w:t>
+      </w:r>
+      <w:r>
+        <w:t>26/03/2026</w:t>
+      </w:r>
+    </w:p>
+    <w:p>
+      <w:pPr>
+        <w:spacing w:line="360" w:lineRule="auto"/>
+        <w:jc w:val="both"/>
+      </w:pPr>
+    </w:p>
+    <w:p>
+      <w:pPr>
+        <w:spacing w:line="360" w:lineRule="auto"/>
+        <w:jc w:val="both"/>
+      </w:pPr>
+      <w:r>
+        <w:rPr>
+          <w:b/>
+          <w:bCs/>
+          <w:u w:val="single"/>
+        </w:rPr>
+        <w:t>Progress since the last meeting, and decisions arrived at during the meeting:</w:t>
+      </w:r>
+    </w:p>
+    <w:p>
+      <w:pPr>
+        <w:spacing w:line="360" w:lineRule="auto"/>
+        <w:jc w:val="both"/>
+      </w:pPr>
+      <w:r>
+        <w:rPr>
+          <w:b/>
+          <w:bCs/>
+        </w:rPr>
+        <w:t>Testing Chapter Guidance (Emphasis on Impact):</w:t>
+      </w:r>
+    </w:p>
+    <w:p>
+      <w:pPr>
+        <w:numPr>
+          <w:ilvl w:val="0"/>
+          <w:numId w:val="5"/>
+        </w:numPr>
+        <w:spacing w:line="360" w:lineRule="auto"/>
+        <w:jc w:val="both"/>
+      </w:pPr>
+      <w:r>
+        <w:t>Evidence of testing must be present in the dissertation (e.g., example session-based test charters, defect summaries, defect concentrations).</w:t>
+      </w:r>
+    </w:p>
+    <w:p>
+      <w:pPr>
+        <w:numPr>
+          <w:ilvl w:val="0"/>
+          <w:numId w:val="5"/>
+        </w:numPr>
+        <w:spacing w:line="360" w:lineRule="auto"/>
+        <w:jc w:val="both"/>
+      </w:pPr>
+      <w:r>
+        <w:t>Not every test charter needs to appear in the dissertation</w:t>
+      </w:r>
+      <w:r>
+        <w:t>:</w:t>
+      </w:r>
+      <w:r>
+        <w:t xml:space="preserve"> a representative selection is sufficient.</w:t>
+      </w:r>
+    </w:p>
+    <w:p>
+      <w:pPr>
+        <w:numPr>
+          <w:ilvl w:val="0"/>
+          <w:numId w:val="5"/>
+        </w:numPr>
+        <w:spacing w:line="360" w:lineRule="auto"/>
+        <w:jc w:val="both"/>
+      </w:pPr>
+      <w:r>
+        <w:t>Key differentiator between an adequate and an excellent testing chapter: demonstrating the IMPACT of testing.</w:t>
+      </w:r>
+    </w:p>
+    <w:p>
+      <w:pPr>
+        <w:numPr>
+          <w:ilvl w:val="0"/>
+          <w:numId w:val="5"/>
+        </w:numPr>
+        <w:spacing w:line="360" w:lineRule="auto"/>
+        <w:jc w:val="both"/>
+      </w:pPr>
+      <w:r>
+        <w:t>S</w:t>
+      </w:r>
+      <w:r>
+        <w:t>howing defects found and documenting the changes driven as a result is what separates a 2:2 from a 2:1/first-class mark in the testing section.</w:t>
+      </w:r>
+      <w:r>
+        <w:t xml:space="preserve"> </w:t>
+      </w:r>
+      <w:r>
+        <w:t>Example: if the chatroom had the greatest prevalence of defects, discuss what that meant and how it was used to improve code efficiency or reduce complexity.</w:t>
+      </w:r>
+    </w:p>
+    <w:p>
+      <w:pPr>
+        <w:spacing w:line="360" w:lineRule="auto"/>
+        <w:jc w:val="both"/>
+      </w:pPr>
+      <w:r>
+        <w:rPr>
+          <w:b/>
+          <w:bCs/>
+        </w:rPr>
+        <w:t>Dissertation Draft Walkthrough – First Half (Chapters 1–3):</w:t>
+      </w:r>
+    </w:p>
+    <w:p>
+      <w:pPr>
+        <w:spacing w:line="360" w:lineRule="auto"/>
+        <w:jc w:val="both"/>
+      </w:pPr>
+      <w:r>
+        <w:rPr>
+          <w:b/>
+          <w:bCs/>
+        </w:rPr>
+        <w:t>Chapter 1 – Introduction:</w:t>
+      </w:r>
+    </w:p>
+    <w:p>
+      <w:pPr>
+        <w:numPr>
+          <w:ilvl w:val="0"/>
+          <w:numId w:val="5"/>
+        </w:numPr>
+        <w:spacing w:line="360" w:lineRule="auto"/>
+        <w:jc w:val="both"/>
+      </w:pPr>
+      <w:r>
+        <w:t>Strong outline noted: introduction covers problem area, context, aims, objectives, and research questions.</w:t>
+      </w:r>
+    </w:p>
+    <w:p>
+      <w:pPr>
+        <w:numPr>
+          <w:ilvl w:val="0"/>
+          <w:numId w:val="5"/>
+        </w:numPr>
+        <w:spacing w:line="360" w:lineRule="auto"/>
+        <w:jc w:val="both"/>
+      </w:pPr>
+      <w:r>
+        <w:t>Section on expected users (1.6) acknowledged</w:t>
+      </w:r>
+      <w:r>
+        <w:t xml:space="preserve">: </w:t>
+      </w:r>
+      <w:r>
+        <w:t>can sit in the introduction or be moved to requirements elicitation depending on where it fits naturally during writing.</w:t>
+      </w:r>
+    </w:p>
+    <w:p>
+      <w:pPr>
+        <w:spacing w:line="360" w:lineRule="auto"/>
+        <w:jc w:val="both"/>
+      </w:pPr>
+      <w:r>
+        <w:rPr>
+          <w:b/>
+          <w:bCs/>
+        </w:rPr>
+        <w:t>Literature Review – Major Structural Change:</w:t>
+      </w:r>
+    </w:p>
+    <w:p>
+      <w:pPr>
+        <w:numPr>
+          <w:ilvl w:val="0"/>
+          <w:numId w:val="5"/>
+        </w:numPr>
+        <w:spacing w:line="360" w:lineRule="auto"/>
+        <w:jc w:val="both"/>
+      </w:pPr>
+      <w:r>
+        <w:t>Literature review should NOT be a standalone section/chapter.</w:t>
+      </w:r>
+    </w:p>
+    <w:p>
+      <w:pPr>
+        <w:numPr>
+          <w:ilvl w:val="0"/>
+          <w:numId w:val="5"/>
+        </w:numPr>
+        <w:spacing w:line="360" w:lineRule="auto"/>
+        <w:jc w:val="both"/>
+      </w:pPr>
+      <w:r>
+        <w:t>Instead, embed the literature within the introduction, requirements, and design chapters where it is relevant.</w:t>
+      </w:r>
+    </w:p>
+    <w:p>
+      <w:pPr>
+        <w:numPr>
+          <w:ilvl w:val="0"/>
+          <w:numId w:val="5"/>
+        </w:numPr>
+        <w:spacing w:line="360" w:lineRule="auto"/>
+        <w:jc w:val="both"/>
+      </w:pPr>
+      <w:r>
+        <w:t>Rebrand the literature review as a subsection within Chapter 2 (Requirements and Specification) called “Requirements Elicitation.”</w:t>
+      </w:r>
+    </w:p>
+    <w:p>
+      <w:pPr>
+        <w:numPr>
+          <w:ilvl w:val="0"/>
+          <w:numId w:val="5"/>
+        </w:numPr>
+        <w:spacing w:line="360" w:lineRule="auto"/>
+        <w:jc w:val="both"/>
+      </w:pPr>
+      <w:r>
+        <w:lastRenderedPageBreak/>
+        <w:t>The purpose of requirements elicitation is to connect the problem statement to the derived requirements: here is the problem → here is the evidence from literature and existing platforms → here is why these requirements address the problem.</w:t>
+      </w:r>
+    </w:p>
+    <w:p>
+      <w:pPr>
+        <w:numPr>
+          <w:ilvl w:val="0"/>
+          <w:numId w:val="5"/>
+        </w:numPr>
+        <w:spacing w:line="360" w:lineRule="auto"/>
+        <w:jc w:val="both"/>
+      </w:pPr>
+      <w:r>
+        <w:t>Suggested structure: (1) discuss commercial platforms (</w:t>
+      </w:r>
+      <w:proofErr w:type="spellStart"/>
+      <w:r>
+        <w:t>Vevox</w:t>
+      </w:r>
+      <w:proofErr w:type="spellEnd"/>
+      <w:r>
+        <w:t xml:space="preserve">, </w:t>
+      </w:r>
+      <w:proofErr w:type="spellStart"/>
+      <w:r>
+        <w:t>Mentimeter</w:t>
+      </w:r>
+      <w:proofErr w:type="spellEnd"/>
+      <w:r>
+        <w:t>) with strengths and weaknesses; (2) discuss academic research in digital pedagogy identifying good practice and opportunities for novel contribution; (3) bridge paragraph linking best elements and identified weaknesses to design requirements.</w:t>
+      </w:r>
+    </w:p>
+    <w:p>
+      <w:pPr>
+        <w:spacing w:line="360" w:lineRule="auto"/>
+        <w:jc w:val="both"/>
+      </w:pPr>
+      <w:r>
+        <w:rPr>
+          <w:b/>
+          <w:bCs/>
+        </w:rPr>
+        <w:t>Warning About Sample Dissertations:</w:t>
+      </w:r>
+    </w:p>
+    <w:p>
+      <w:pPr>
+        <w:numPr>
+          <w:ilvl w:val="0"/>
+          <w:numId w:val="5"/>
+        </w:numPr>
+        <w:spacing w:line="360" w:lineRule="auto"/>
+        <w:jc w:val="both"/>
+      </w:pPr>
+      <w:r>
+        <w:t>Previous sample dissertations on Canvas have very different structures per project</w:t>
+      </w:r>
+      <w:r>
+        <w:t xml:space="preserve">: </w:t>
+      </w:r>
+      <w:r>
+        <w:t>following another student’s structure could disadvantage marks.</w:t>
+      </w:r>
+    </w:p>
+    <w:p>
+      <w:pPr>
+        <w:numPr>
+          <w:ilvl w:val="0"/>
+          <w:numId w:val="5"/>
+        </w:numPr>
+        <w:spacing w:line="360" w:lineRule="auto"/>
+        <w:jc w:val="both"/>
+      </w:pPr>
+      <w:r>
+        <w:t>Two golden sources: (1) the project handbook (marking scheme is based around it), and (2) bespoke guidance tailored to this specific project.</w:t>
+      </w:r>
+    </w:p>
+    <w:p>
+      <w:pPr>
+        <w:spacing w:line="360" w:lineRule="auto"/>
+        <w:jc w:val="both"/>
+      </w:pPr>
+      <w:r>
+        <w:rPr>
+          <w:b/>
+          <w:bCs/>
+        </w:rPr>
+        <w:t>Chapter 2 – Requirements and Specification:</w:t>
+      </w:r>
+    </w:p>
+    <w:p>
+      <w:pPr>
+        <w:numPr>
+          <w:ilvl w:val="0"/>
+          <w:numId w:val="5"/>
+        </w:numPr>
+        <w:spacing w:line="360" w:lineRule="auto"/>
+        <w:jc w:val="both"/>
+      </w:pPr>
+      <w:r>
+        <w:t>Requirements elicitation (rebranded literature review) should be the first section – this connects the problem to the requirements.</w:t>
+      </w:r>
+    </w:p>
+    <w:p>
+      <w:pPr>
+        <w:numPr>
+          <w:ilvl w:val="0"/>
+          <w:numId w:val="5"/>
+        </w:numPr>
+        <w:spacing w:line="360" w:lineRule="auto"/>
+        <w:jc w:val="both"/>
+      </w:pPr>
+      <w:r>
+        <w:t>Add a section on constraints and assumptions (e.g., single developer, limited equipment, no premium AI API access).</w:t>
+      </w:r>
+    </w:p>
+    <w:p>
+      <w:pPr>
+        <w:numPr>
+          <w:ilvl w:val="0"/>
+          <w:numId w:val="5"/>
+        </w:numPr>
+        <w:spacing w:line="360" w:lineRule="auto"/>
+        <w:jc w:val="both"/>
+      </w:pPr>
+      <w:r>
+        <w:t>Include target user characteristics and needs either in the introduction or in requirements elicitation.</w:t>
+      </w:r>
+    </w:p>
+    <w:p>
+      <w:pPr>
+        <w:numPr>
+          <w:ilvl w:val="0"/>
+          <w:numId w:val="5"/>
+        </w:numPr>
+        <w:spacing w:line="360" w:lineRule="auto"/>
+        <w:jc w:val="both"/>
+      </w:pPr>
+      <w:r>
+        <w:t>Non-functional requirements must be testable</w:t>
+      </w:r>
+      <w:r>
+        <w:t xml:space="preserve">: </w:t>
+      </w:r>
+      <w:r>
+        <w:t>for each requirement, there must be a way to demonstrate whether it has been achieved (e.g., “performance: less than 1-second latency” needs a verification method).</w:t>
+      </w:r>
+    </w:p>
+    <w:p>
+      <w:pPr>
+        <w:spacing w:line="360" w:lineRule="auto"/>
+        <w:jc w:val="both"/>
+      </w:pPr>
+      <w:r>
+        <w:rPr>
+          <w:b/>
+          <w:bCs/>
+        </w:rPr>
+        <w:t>Chapter 3 – Design:</w:t>
+      </w:r>
+    </w:p>
+    <w:p>
+      <w:pPr>
+        <w:numPr>
+          <w:ilvl w:val="0"/>
+          <w:numId w:val="5"/>
+        </w:numPr>
+        <w:spacing w:line="360" w:lineRule="auto"/>
+        <w:jc w:val="both"/>
+      </w:pPr>
+      <w:r>
+        <w:t>Split design into front-end (HTML/CSS/JavaScript) and back-end (APIs, Node.js, database, other technologies).</w:t>
+      </w:r>
+    </w:p>
+    <w:p>
+      <w:pPr>
+        <w:numPr>
+          <w:ilvl w:val="0"/>
+          <w:numId w:val="5"/>
+        </w:numPr>
+        <w:spacing w:line="360" w:lineRule="auto"/>
+        <w:jc w:val="both"/>
+      </w:pPr>
+      <w:r>
+        <w:t xml:space="preserve">Justify all technology decisions with a “WHY” rationale, not just “what” was used. Example: Why MongoDB over MySQL? Why </w:t>
+      </w:r>
+      <w:proofErr w:type="spellStart"/>
+      <w:r>
+        <w:t>WebSockets</w:t>
+      </w:r>
+      <w:proofErr w:type="spellEnd"/>
+      <w:r>
+        <w:t xml:space="preserve"> over Ajax?</w:t>
+      </w:r>
+    </w:p>
+    <w:p>
+      <w:pPr>
+        <w:numPr>
+          <w:ilvl w:val="0"/>
+          <w:numId w:val="5"/>
+        </w:numPr>
+        <w:spacing w:line="360" w:lineRule="auto"/>
+        <w:jc w:val="both"/>
+      </w:pPr>
+      <w:r>
+        <w:t>For MongoDB specifically: the flexible schema benefit is less relevant here since a standardised data model is used – identify other valid reasons for the choice.</w:t>
+      </w:r>
+    </w:p>
+    <w:p>
+      <w:pPr>
+        <w:numPr>
+          <w:ilvl w:val="0"/>
+          <w:numId w:val="5"/>
+        </w:numPr>
+        <w:spacing w:line="360" w:lineRule="auto"/>
+        <w:jc w:val="both"/>
+      </w:pPr>
+      <w:r>
+        <w:t>Include full database collection schemas.</w:t>
+      </w:r>
+    </w:p>
+    <w:p>
+      <w:pPr>
+        <w:numPr>
+          <w:ilvl w:val="0"/>
+          <w:numId w:val="5"/>
+        </w:numPr>
+        <w:spacing w:line="360" w:lineRule="auto"/>
+        <w:jc w:val="both"/>
+      </w:pPr>
+      <w:r>
+        <w:t>Add a data protection subsection alongside security design, given that student names, emails, and potentially sensitive information are captured.</w:t>
+      </w:r>
+    </w:p>
+    <w:p>
+      <w:pPr>
+        <w:numPr>
+          <w:ilvl w:val="0"/>
+          <w:numId w:val="5"/>
+        </w:numPr>
+        <w:spacing w:line="360" w:lineRule="auto"/>
+        <w:jc w:val="both"/>
+      </w:pPr>
+      <w:r>
+        <w:t>User interface design section should include accessibility considerations: high-contrast backgrounds, clear language, screen reader compatibility.</w:t>
+      </w:r>
+    </w:p>
+    <w:p>
+      <w:pPr>
+        <w:numPr>
+          <w:ilvl w:val="0"/>
+          <w:numId w:val="5"/>
+        </w:numPr>
+        <w:spacing w:line="360" w:lineRule="auto"/>
+        <w:jc w:val="both"/>
+      </w:pPr>
+      <w:r>
+        <w:lastRenderedPageBreak/>
+        <w:t>Include wireframes (not for every page, but a representative template).</w:t>
+      </w:r>
+    </w:p>
+    <w:p>
+      <w:pPr>
+        <w:numPr>
+          <w:ilvl w:val="0"/>
+          <w:numId w:val="5"/>
+        </w:numPr>
+        <w:spacing w:line="360" w:lineRule="auto"/>
+        <w:jc w:val="both"/>
+      </w:pPr>
+      <w:r>
+        <w:t xml:space="preserve">Link UI design decisions back to literature and requirements </w:t>
+      </w:r>
+      <w:proofErr w:type="gramStart"/>
+      <w:r>
+        <w:t>elicitation</w:t>
+      </w:r>
+      <w:r>
+        <w:t xml:space="preserve"> </w:t>
+      </w:r>
+      <w:r>
+        <w:t xml:space="preserve"> </w:t>
+      </w:r>
+      <w:r>
+        <w:t>(</w:t>
+      </w:r>
+      <w:proofErr w:type="gramEnd"/>
+      <w:r>
+        <w:t>justify mobile-first responsive design by referencing target user behaviour patterns</w:t>
+      </w:r>
+      <w:r>
+        <w:t>)</w:t>
+      </w:r>
+      <w:r>
+        <w:t>.</w:t>
+      </w:r>
+    </w:p>
+    <w:p>
+      <w:pPr>
+        <w:spacing w:line="360" w:lineRule="auto"/>
+        <w:jc w:val="both"/>
+      </w:pPr>
+      <w:r>
+        <w:rPr>
+          <w:b/>
+          <w:bCs/>
+        </w:rPr>
+        <w:t>General Dissertation Advice:</w:t>
+      </w:r>
+    </w:p>
+    <w:p>
+      <w:pPr>
+        <w:numPr>
+          <w:ilvl w:val="0"/>
+          <w:numId w:val="5"/>
+        </w:numPr>
+        <w:spacing w:line="360" w:lineRule="auto"/>
+        <w:jc w:val="both"/>
+      </w:pPr>
+      <w:r>
+        <w:t>After writing each section, benchmark against the project handbook to ensure nothing has been missed.</w:t>
+      </w:r>
+    </w:p>
+    <w:p>
+      <w:pPr>
+        <w:numPr>
+          <w:ilvl w:val="0"/>
+          <w:numId w:val="5"/>
+        </w:numPr>
+        <w:spacing w:line="360" w:lineRule="auto"/>
+        <w:jc w:val="both"/>
+      </w:pPr>
+      <w:r>
+        <w:t>If something in the handbook does not seem applicable to this project, check before omitting it.</w:t>
+      </w:r>
+    </w:p>
+    <w:p>
+      <w:pPr>
+        <w:numPr>
+          <w:ilvl w:val="0"/>
+          <w:numId w:val="5"/>
+        </w:numPr>
+        <w:spacing w:line="360" w:lineRule="auto"/>
+        <w:jc w:val="both"/>
+      </w:pPr>
+      <w:r>
+        <w:t>The second half of the dissertation (implementation, testing, evaluation) to be discussed in the next meeting.</w:t>
+      </w:r>
+    </w:p>
+    <w:p>
+      <w:pPr>
+        <w:spacing w:line="360" w:lineRule="auto"/>
+        <w:jc w:val="both"/>
+      </w:pPr>
+    </w:p>
+    <w:p>
+      <w:pPr>
+        <w:spacing w:line="360" w:lineRule="auto"/>
+        <w:jc w:val="both"/>
+      </w:pPr>
+      <w:r>
+        <w:rPr>
+          <w:b/>
+          <w:bCs/>
+          <w:u w:val="single"/>
+        </w:rPr>
+        <w:t>Action Points:</w:t>
+      </w:r>
+    </w:p>
+    <w:p>
+      <w:pPr>
+        <w:numPr>
+          <w:ilvl w:val="0"/>
+          <w:numId w:val="5"/>
+        </w:numPr>
+        <w:spacing w:line="360" w:lineRule="auto"/>
+        <w:jc w:val="both"/>
+      </w:pPr>
+      <w:r>
+        <w:t>Restructure the literature review as “Requirements Elicitation” – a subsection within Chapter 2 that connects the problem statement to the derived requirements.</w:t>
+      </w:r>
+    </w:p>
+    <w:p>
+      <w:pPr>
+        <w:numPr>
+          <w:ilvl w:val="0"/>
+          <w:numId w:val="5"/>
+        </w:numPr>
+        <w:spacing w:line="360" w:lineRule="auto"/>
+        <w:jc w:val="both"/>
+      </w:pPr>
+      <w:r>
+        <w:t>Add constraints, assumptions, and target user characteristics to Chapter 2.</w:t>
+      </w:r>
+    </w:p>
+    <w:p>
+      <w:pPr>
+        <w:numPr>
+          <w:ilvl w:val="0"/>
+          <w:numId w:val="5"/>
+        </w:numPr>
+        <w:spacing w:line="360" w:lineRule="auto"/>
+        <w:jc w:val="both"/>
+      </w:pPr>
+      <w:r>
+        <w:t>Ensure all non-functional requirements are testable with a clear verification method.</w:t>
+      </w:r>
+    </w:p>
+    <w:p>
+      <w:pPr>
+        <w:numPr>
+          <w:ilvl w:val="0"/>
+          <w:numId w:val="5"/>
+        </w:numPr>
+        <w:spacing w:line="360" w:lineRule="auto"/>
+        <w:jc w:val="both"/>
+      </w:pPr>
+      <w:r>
+        <w:t>In Chapter 3, justify every technology decision (WHY, not just WHAT) and add a data protection subsection.</w:t>
+      </w:r>
+    </w:p>
+    <w:p>
+      <w:pPr>
+        <w:numPr>
+          <w:ilvl w:val="0"/>
+          <w:numId w:val="5"/>
+        </w:numPr>
+        <w:spacing w:line="360" w:lineRule="auto"/>
+        <w:jc w:val="both"/>
+      </w:pPr>
+      <w:r>
+        <w:t>Add accessibility considerations and wireframes to the user interface design section.</w:t>
+      </w:r>
+    </w:p>
+    <w:p>
+      <w:pPr>
+        <w:numPr>
+          <w:ilvl w:val="0"/>
+          <w:numId w:val="5"/>
+        </w:numPr>
+        <w:spacing w:line="360" w:lineRule="auto"/>
+        <w:jc w:val="both"/>
+      </w:pPr>
+      <w:r>
+        <w:t>Continue writing the first half of the dissertation (Chapters 1–3) incorporating supervisor feedback.</w:t>
+      </w:r>
+    </w:p>
+    <w:p>
+      <w:pPr>
+        <w:numPr>
+          <w:ilvl w:val="0"/>
+          <w:numId w:val="5"/>
+        </w:numPr>
+        <w:spacing w:line="360" w:lineRule="auto"/>
+        <w:jc w:val="both"/>
+      </w:pPr>
+      <w:r>
+        <w:t>Benchmark draft content against the project handbook after each section.</w:t>
+      </w:r>
+    </w:p>
+    <w:p>
+      <w:pPr>
+        <w:spacing w:line="360" w:lineRule="auto"/>
+        <w:jc w:val="both"/>
+      </w:pPr>
+    </w:p>
+    <w:p>
+      <w:pPr>
+        <w:spacing w:line="360" w:lineRule="auto"/>
+        <w:jc w:val="both"/>
+      </w:pPr>
+      <w:r>
+        <w:rPr>
+          <w:b/>
+          <w:bCs/>
+        </w:rPr>
+        <w:t xml:space="preserve">Date of next meeting: </w:t>
+      </w:r>
+      <w:r>
+        <w:t>02/04/2026 (10.30)</w:t>
+      </w:r>
+    </w:p>
+    <w:p>
+      <w:pPr>
+        <w:spacing w:line="360" w:lineRule="auto"/>
+        <w:jc w:val="both"/>
+      </w:pPr>
+    </w:p>
+    <w:p>
+      <w:pPr>
+        <w:spacing w:line="360" w:lineRule="auto"/>
+        <w:jc w:val="both"/>
+      </w:pPr>
+      <w:r>
+        <w:rPr>
+          <w:i/>
+          <w:iCs/>
+        </w:rPr>
+        <w:t>Agreed minutes should be initialled by the supervisor.</w:t>
+      </w:r>
+    </w:p>
+    <w:p>
+      <w:pPr>
+        <w:spacing w:line="360" w:lineRule="auto"/>
+        <w:jc w:val="both"/>
+      </w:pPr>
+      <w:r>
+        <w:rPr>
+          <w:b/>
+          <w:bCs/>
+        </w:rPr>
+        <w:t>Supervisor’s Initials:</w:t>
+      </w:r>
+      <w:r>
+        <w:t xml:space="preserve"> ___________ Date: ___________</w:t>
+      </w:r>
+    </w:p>
+    <w:p>
+      <w:pPr>
+        <w:spacing w:line="360" w:lineRule="auto"/>
+        <w:jc w:val="both"/>
+      </w:pPr>
+    </w:p>
+    <w:p>
+      <w:pPr>
+        <w:spacing w:line="360" w:lineRule="auto"/>
+        <w:jc w:val="both"/>
+      </w:pPr>
+      <w:r>
+        <w:rPr>
+          <w:b/>
+          <w:bCs/>
+          <w:u w:val="single"/>
+        </w:rPr>
+        <w:t>Supervisor’s Comments:</w:t>
+      </w:r>
+    </w:p>
+    <w:p>
+      <w:pPr>
+        <w:spacing w:line="360" w:lineRule="auto"/>
+        <w:jc w:val="both"/>
+      </w:pPr>
+    </w:p>
+    <w:p>
+      <w:pPr>
+        <w:spacing w:line="360" w:lineRule="auto"/>
+        <w:jc w:val="both"/>
+      </w:pPr>
+    </w:p>
+    <w:p>
+      <w:pPr>
+        <w:spacing w:line="360" w:lineRule="auto"/>
+        <w:jc w:val="both"/>
+      </w:pPr>
+    </w:p>
+    <w:p>
+      <w:pPr>
+        <w:spacing w:line="360" w:lineRule="auto"/>
+        <w:jc w:val="both"/>
+      </w:pPr>
+    </w:p>
+    <w:p>
+      <w:pPr>
+        <w:spacing w:line="360" w:lineRule="auto"/>
+        <w:jc w:val="both"/>
+      </w:pPr>
+    </w:p>
+    <w:p>
+      <w:pPr>
+        <w:spacing w:line="360" w:lineRule="auto"/>
+        <w:jc w:val="both"/>
+      </w:pPr>
+      <w:r>
+        <w:rPr>
+          <w:b/>
+          <w:bCs/>
+        </w:rPr>
+        <w:lastRenderedPageBreak/>
+        <w:t>QUEEN’S UNIVERSITY OF BELFAST COMPUTER SCIENCE</w:t>
+      </w:r>
+    </w:p>
+    <w:p>
+      <w:pPr>
+        <w:spacing w:line="360" w:lineRule="auto"/>
+        <w:jc w:val="both"/>
+      </w:pPr>
+      <w:r>
+        <w:rPr>
+          <w:b/>
+          <w:bCs/>
+        </w:rPr>
+        <w:t>Minutes of Project Supervision Meeting</w:t>
+      </w:r>
+    </w:p>
+    <w:p>
+      <w:pPr>
+        <w:spacing w:line="360" w:lineRule="auto"/>
+        <w:jc w:val="both"/>
+      </w:pPr>
+      <w:r>
+        <w:rPr>
+          <w:b/>
+          <w:bCs/>
+        </w:rPr>
+        <w:t xml:space="preserve">Student Name: </w:t>
+      </w:r>
+      <w:r>
+        <w:t>Gabriella Keisha Andini</w:t>
+      </w:r>
+    </w:p>
+    <w:p>
+      <w:pPr>
+        <w:spacing w:line="360" w:lineRule="auto"/>
+        <w:jc w:val="both"/>
+      </w:pPr>
+      <w:r>
+        <w:rPr>
+          <w:b/>
+          <w:bCs/>
+        </w:rPr>
+        <w:t xml:space="preserve">Project Module Code: </w:t>
+      </w:r>
+      <w:r>
+        <w:t>CSC3002</w:t>
+      </w:r>
+    </w:p>
+    <w:p>
+      <w:pPr>
+        <w:spacing w:line="360" w:lineRule="auto"/>
+        <w:jc w:val="both"/>
+      </w:pPr>
+      <w:r>
+        <w:rPr>
+          <w:b/>
+          <w:bCs/>
+        </w:rPr>
+        <w:t xml:space="preserve">Project Supervisor: </w:t>
+      </w:r>
+      <w:r>
+        <w:t>Andrew McDowell</w:t>
+      </w:r>
+    </w:p>
+    <w:p>
+      <w:pPr>
+        <w:spacing w:line="360" w:lineRule="auto"/>
+        <w:jc w:val="both"/>
+      </w:pPr>
+      <w:r>
+        <w:rPr>
+          <w:b/>
+          <w:bCs/>
+        </w:rPr>
+        <w:t xml:space="preserve">Meeting Number: </w:t>
+      </w:r>
+      <w:r>
+        <w:t>20</w:t>
+      </w:r>
+    </w:p>
+    <w:p>
+      <w:pPr>
+        <w:spacing w:line="360" w:lineRule="auto"/>
+        <w:jc w:val="both"/>
+      </w:pPr>
+      <w:r>
+        <w:rPr>
+          <w:b/>
+          <w:bCs/>
+        </w:rPr>
+        <w:t xml:space="preserve">Date of Meeting: </w:t>
+      </w:r>
+      <w:r>
+        <w:t>02/04/2026</w:t>
+      </w:r>
+    </w:p>
+    <w:p>
+      <w:pPr>
+        <w:spacing w:line="360" w:lineRule="auto"/>
+        <w:jc w:val="both"/>
+      </w:pPr>
+    </w:p>
+    <w:p>
+      <w:pPr>
+        <w:spacing w:line="360" w:lineRule="auto"/>
+        <w:jc w:val="both"/>
+      </w:pPr>
+      <w:r>
+        <w:rPr>
+          <w:b/>
+          <w:bCs/>
+          <w:u w:val="single"/>
+        </w:rPr>
+        <w:t>Progress since the last meeting, and decisions arrived at during the meeting:</w:t>
+      </w:r>
+    </w:p>
+    <w:p>
+      <w:pPr>
+        <w:spacing w:line="360" w:lineRule="auto"/>
+        <w:jc w:val="both"/>
+      </w:pPr>
+      <w:r>
+        <w:rPr>
+          <w:b/>
+          <w:bCs/>
+        </w:rPr>
+        <w:t>Dissertation Structure Review:</w:t>
+      </w:r>
+    </w:p>
+    <w:p>
+      <w:pPr>
+        <w:numPr>
+          <w:ilvl w:val="0"/>
+          <w:numId w:val="6"/>
+        </w:numPr>
+        <w:spacing w:line="360" w:lineRule="auto"/>
+        <w:jc w:val="both"/>
+      </w:pPr>
+      <w:r>
+        <w:t>Reviewed the draft dissertation table of contents and structure in detail.</w:t>
+      </w:r>
+    </w:p>
+    <w:p>
+      <w:pPr>
+        <w:spacing w:line="360" w:lineRule="auto"/>
+        <w:jc w:val="both"/>
+      </w:pPr>
+      <w:r>
+        <w:rPr>
+          <w:b/>
+          <w:bCs/>
+        </w:rPr>
+        <w:t>Use Cases vs Functional Requirements (Chapter 2):</w:t>
+      </w:r>
+    </w:p>
+    <w:p>
+      <w:pPr>
+        <w:numPr>
+          <w:ilvl w:val="0"/>
+          <w:numId w:val="6"/>
+        </w:numPr>
+        <w:spacing w:line="360" w:lineRule="auto"/>
+        <w:jc w:val="both"/>
+      </w:pPr>
+      <w:r>
+        <w:t>Queried the difference between the use cases section and functional requirements, as both are mechanisms for capturing requirements.</w:t>
+      </w:r>
+    </w:p>
+    <w:p>
+      <w:pPr>
+        <w:numPr>
+          <w:ilvl w:val="0"/>
+          <w:numId w:val="6"/>
+        </w:numPr>
+        <w:spacing w:line="360" w:lineRule="auto"/>
+        <w:jc w:val="both"/>
+      </w:pPr>
+      <w:r>
+        <w:t>Current use cases do not follow the formal structure (primary/alternate paths, preconditions, etc.) and may be better described as user scenarios.</w:t>
+      </w:r>
+    </w:p>
+    <w:p>
+      <w:pPr>
+        <w:numPr>
+          <w:ilvl w:val="0"/>
+          <w:numId w:val="6"/>
+        </w:numPr>
+        <w:spacing w:line="360" w:lineRule="auto"/>
+        <w:jc w:val="both"/>
+      </w:pPr>
+      <w:r>
+        <w:t>Student advised to review software engineering notes on the distinction between use cases, user scenarios, and functional requirements.</w:t>
+      </w:r>
+    </w:p>
+    <w:p>
+      <w:pPr>
+        <w:numPr>
+          <w:ilvl w:val="0"/>
+          <w:numId w:val="6"/>
+        </w:numPr>
+        <w:spacing w:line="360" w:lineRule="auto"/>
+        <w:jc w:val="both"/>
+      </w:pPr>
+      <w:r>
+        <w:t>User scenarios recommended as a good fit: they provide a narrative; human view of how the application operates and can be used to derive requirements.</w:t>
+      </w:r>
+    </w:p>
+    <w:p>
+      <w:pPr>
+        <w:spacing w:line="360" w:lineRule="auto"/>
+        <w:jc w:val="both"/>
+      </w:pPr>
+      <w:r>
+        <w:rPr>
+          <w:b/>
+          <w:bCs/>
+        </w:rPr>
+        <w:t>User Interface Design (Section 3.6):</w:t>
+      </w:r>
+    </w:p>
+    <w:p>
+      <w:pPr>
+        <w:numPr>
+          <w:ilvl w:val="0"/>
+          <w:numId w:val="6"/>
+        </w:numPr>
+        <w:spacing w:line="360" w:lineRule="auto"/>
+        <w:jc w:val="both"/>
+      </w:pPr>
+      <w:r>
+        <w:t>Section identified as shorter than expected given the importance of usability to this project.</w:t>
+      </w:r>
+    </w:p>
+    <w:p>
+      <w:pPr>
+        <w:numPr>
+          <w:ilvl w:val="0"/>
+          <w:numId w:val="6"/>
+        </w:numPr>
+        <w:spacing w:line="360" w:lineRule="auto"/>
+        <w:jc w:val="both"/>
+      </w:pPr>
+      <w:r>
+        <w:t>Noted a common tendency for CS students to focus on back end over front-end, but this project requires a balance between both.</w:t>
+      </w:r>
+    </w:p>
+    <w:p>
+      <w:pPr>
+        <w:numPr>
+          <w:ilvl w:val="0"/>
+          <w:numId w:val="6"/>
+        </w:numPr>
+        <w:spacing w:line="360" w:lineRule="auto"/>
+        <w:jc w:val="both"/>
+      </w:pPr>
+      <w:r>
+        <w:t>Advised to include discussion of established UI design patterns for chatroom interfaces, particularly in mobile environments: not just citing WhatsApp as inspiration but referencing the underlying design patterns that commercial platforms are built on.</w:t>
+      </w:r>
+    </w:p>
+    <w:p>
+      <w:pPr>
+        <w:numPr>
+          <w:ilvl w:val="0"/>
+          <w:numId w:val="6"/>
+        </w:numPr>
+        <w:spacing w:line="360" w:lineRule="auto"/>
+        <w:jc w:val="both"/>
+      </w:pPr>
+      <w:r>
+        <w:t>Wireframes showing the basic layout/architecture of pages should be included.</w:t>
+      </w:r>
+    </w:p>
+    <w:p>
+      <w:pPr>
+        <w:numPr>
+          <w:ilvl w:val="0"/>
+          <w:numId w:val="6"/>
+        </w:numPr>
+        <w:spacing w:line="360" w:lineRule="auto"/>
+        <w:jc w:val="both"/>
+      </w:pPr>
+      <w:r>
+        <w:t>Insufficient attention to UI design in the dissertation could count against the mark.</w:t>
+      </w:r>
+    </w:p>
+    <w:p>
+      <w:pPr>
+        <w:spacing w:line="360" w:lineRule="auto"/>
+        <w:jc w:val="both"/>
+      </w:pPr>
+      <w:r>
+        <w:rPr>
+          <w:b/>
+          <w:bCs/>
+        </w:rPr>
+        <w:t>Implementation Chapter (Chapter 4):</w:t>
+      </w:r>
+    </w:p>
+    <w:p>
+      <w:pPr>
+        <w:numPr>
+          <w:ilvl w:val="0"/>
+          <w:numId w:val="6"/>
+        </w:numPr>
+        <w:spacing w:line="360" w:lineRule="auto"/>
+        <w:jc w:val="both"/>
+      </w:pPr>
+      <w:r>
+        <w:t>Suggested adding clarifying labels to section headings (e.g., “4.1 Real-Time Communication (</w:t>
+      </w:r>
+      <w:proofErr w:type="spellStart"/>
+      <w:r>
+        <w:t>WebSockets</w:t>
+      </w:r>
+      <w:proofErr w:type="spellEnd"/>
+      <w:r>
+        <w:t>)”) to make the technology focus immediately obvious.</w:t>
+      </w:r>
+    </w:p>
+    <w:p>
+      <w:pPr>
+        <w:spacing w:line="360" w:lineRule="auto"/>
+        <w:jc w:val="both"/>
+      </w:pPr>
+      <w:r>
+        <w:rPr>
+          <w:b/>
+          <w:bCs/>
+        </w:rPr>
+        <w:t>Chapters 5 and 6 – Restructuring Required:</w:t>
+      </w:r>
+    </w:p>
+    <w:p>
+      <w:pPr>
+        <w:numPr>
+          <w:ilvl w:val="0"/>
+          <w:numId w:val="6"/>
+        </w:numPr>
+        <w:spacing w:line="360" w:lineRule="auto"/>
+        <w:jc w:val="both"/>
+      </w:pPr>
+      <w:r>
+        <w:lastRenderedPageBreak/>
+        <w:t>Content from Section 5.7 onwards (critical appraisal, achievements, limitations) likely belongs in Chapter 6 (System Evaluation and Experimental Results) rather than in the Testing chapter.</w:t>
+      </w:r>
+    </w:p>
+    <w:p>
+      <w:pPr>
+        <w:numPr>
+          <w:ilvl w:val="0"/>
+          <w:numId w:val="6"/>
+        </w:numPr>
+        <w:spacing w:line="360" w:lineRule="auto"/>
+        <w:jc w:val="both"/>
+      </w:pPr>
+      <w:r>
+        <w:t>The project handbook specifies Testing as a standalone chapter, followed by a separate System Evaluation and Experimental Results chapter.</w:t>
+      </w:r>
+    </w:p>
+    <w:p>
+      <w:pPr>
+        <w:numPr>
+          <w:ilvl w:val="0"/>
+          <w:numId w:val="6"/>
+        </w:numPr>
+        <w:spacing w:line="360" w:lineRule="auto"/>
+        <w:jc w:val="both"/>
+      </w:pPr>
+      <w:r>
+        <w:t>Chapter 6 should be structured around objectives: take each objective as a sub-header, reflect on testing results, and describe the extent to which each objective has been achieved.</w:t>
+      </w:r>
+    </w:p>
+    <w:p>
+      <w:pPr>
+        <w:numPr>
+          <w:ilvl w:val="0"/>
+          <w:numId w:val="6"/>
+        </w:numPr>
+        <w:spacing w:line="360" w:lineRule="auto"/>
+        <w:jc w:val="both"/>
+      </w:pPr>
+      <w:r>
+        <w:t>This feeds into research question reflection and experimental results, tied together with an overarching conclusion.</w:t>
+      </w:r>
+    </w:p>
+    <w:p>
+      <w:pPr>
+        <w:numPr>
+          <w:ilvl w:val="0"/>
+          <w:numId w:val="6"/>
+        </w:numPr>
+        <w:spacing w:line="360" w:lineRule="auto"/>
+        <w:jc w:val="both"/>
+      </w:pPr>
+      <w:r>
+        <w:t>Achievements section should be framed as a critical evaluation against aims and objectives, not a list of accomplishments.</w:t>
+      </w:r>
+    </w:p>
+    <w:p>
+      <w:pPr>
+        <w:spacing w:line="360" w:lineRule="auto"/>
+        <w:jc w:val="both"/>
+      </w:pPr>
+      <w:r>
+        <w:rPr>
+          <w:b/>
+          <w:bCs/>
+        </w:rPr>
+        <w:t>Testing Chapter Guidance:</w:t>
+      </w:r>
+    </w:p>
+    <w:p>
+      <w:pPr>
+        <w:numPr>
+          <w:ilvl w:val="0"/>
+          <w:numId w:val="6"/>
+        </w:numPr>
+        <w:spacing w:line="360" w:lineRule="auto"/>
+        <w:jc w:val="both"/>
+      </w:pPr>
+      <w:r>
+        <w:t>Include a few representative examples of tests to demonstrate depth and spread – not all tests, just a flavour.</w:t>
+      </w:r>
+    </w:p>
+    <w:p>
+      <w:pPr>
+        <w:numPr>
+          <w:ilvl w:val="0"/>
+          <w:numId w:val="6"/>
+        </w:numPr>
+        <w:spacing w:line="360" w:lineRule="auto"/>
+        <w:jc w:val="both"/>
+      </w:pPr>
+      <w:r>
+        <w:t>Focus on defects identified: maintain a defect log, document defects found and fixes applied.</w:t>
+      </w:r>
+    </w:p>
+    <w:p>
+      <w:pPr>
+        <w:numPr>
+          <w:ilvl w:val="0"/>
+          <w:numId w:val="6"/>
+        </w:numPr>
+        <w:spacing w:line="360" w:lineRule="auto"/>
+        <w:jc w:val="both"/>
+      </w:pPr>
+      <w:r>
+        <w:t xml:space="preserve">Key differentiator: What do testing results tell you about the quality of the software? What changes were made </w:t>
+      </w:r>
+      <w:r>
+        <w:t>because of</w:t>
+      </w:r>
+      <w:r>
+        <w:t xml:space="preserve"> testing? Students who address this perform significantly better in the testing chapter.</w:t>
+      </w:r>
+    </w:p>
+    <w:p>
+      <w:pPr>
+        <w:numPr>
+          <w:ilvl w:val="0"/>
+          <w:numId w:val="6"/>
+        </w:numPr>
+        <w:spacing w:line="360" w:lineRule="auto"/>
+        <w:jc w:val="both"/>
+      </w:pPr>
+      <w:r>
+        <w:t>Before/after screenshots not required for unit/integration tests, but useful for UX changes where visual evidence of meaningful change (e.g., UI improvements driven by feedback) adds value.</w:t>
+      </w:r>
+    </w:p>
+    <w:p>
+      <w:pPr>
+        <w:numPr>
+          <w:ilvl w:val="0"/>
+          <w:numId w:val="6"/>
+        </w:numPr>
+        <w:spacing w:line="360" w:lineRule="auto"/>
+        <w:jc w:val="both"/>
+      </w:pPr>
+      <w:r>
+        <w:t>SBT session reports to be placed in the appendix; key findings and impact discussed in the main text.</w:t>
+      </w:r>
+    </w:p>
+    <w:p>
+      <w:pPr>
+        <w:spacing w:line="360" w:lineRule="auto"/>
+        <w:jc w:val="both"/>
+      </w:pPr>
+      <w:r>
+        <w:rPr>
+          <w:b/>
+          <w:bCs/>
+        </w:rPr>
+        <w:t>Page Limit Clarification:</w:t>
+      </w:r>
+    </w:p>
+    <w:p>
+      <w:pPr>
+        <w:numPr>
+          <w:ilvl w:val="0"/>
+          <w:numId w:val="6"/>
+        </w:numPr>
+        <w:spacing w:line="360" w:lineRule="auto"/>
+        <w:jc w:val="both"/>
+      </w:pPr>
+      <w:r>
+        <w:t>Maximum 45 pages covers Chapter 1 through Chapter 6 only. Abstract, table of contents, bibliography, and appendices are excluded from the count.</w:t>
+      </w:r>
+    </w:p>
+    <w:p>
+      <w:pPr>
+        <w:spacing w:line="360" w:lineRule="auto"/>
+        <w:jc w:val="both"/>
+      </w:pPr>
+      <w:r>
+        <w:rPr>
+          <w:b/>
+          <w:bCs/>
+        </w:rPr>
+        <w:t>Final Demo Scheduling:</w:t>
+      </w:r>
+    </w:p>
+    <w:p>
+      <w:pPr>
+        <w:numPr>
+          <w:ilvl w:val="0"/>
+          <w:numId w:val="6"/>
+        </w:numPr>
+        <w:spacing w:line="360" w:lineRule="auto"/>
+        <w:jc w:val="both"/>
+      </w:pPr>
+      <w:r>
+        <w:t>Demo will not be on the same day as dissertation submission.</w:t>
+      </w:r>
+    </w:p>
+    <w:p>
+      <w:pPr>
+        <w:numPr>
+          <w:ilvl w:val="0"/>
+          <w:numId w:val="6"/>
+        </w:numPr>
+        <w:spacing w:line="360" w:lineRule="auto"/>
+        <w:jc w:val="both"/>
+      </w:pPr>
+      <w:r>
+        <w:t>After easter, will contact the second assessor and release bookable time slots (first come, first served).</w:t>
+      </w:r>
+    </w:p>
+    <w:p>
+      <w:pPr>
+        <w:numPr>
+          <w:ilvl w:val="0"/>
+          <w:numId w:val="6"/>
+        </w:numPr>
+        <w:spacing w:line="360" w:lineRule="auto"/>
+        <w:jc w:val="both"/>
+      </w:pPr>
+      <w:r>
+        <w:t xml:space="preserve">Demos expected within </w:t>
+      </w:r>
+      <w:r>
+        <w:t xml:space="preserve">around </w:t>
+      </w:r>
+      <w:r>
+        <w:t>1</w:t>
+      </w:r>
+      <w:r>
+        <w:t xml:space="preserve"> </w:t>
+      </w:r>
+      <w:r>
+        <w:t>week after submission, depending on assessor availability.</w:t>
+      </w:r>
+    </w:p>
+    <w:p>
+      <w:pPr>
+        <w:spacing w:line="360" w:lineRule="auto"/>
+        <w:jc w:val="both"/>
+      </w:pPr>
+    </w:p>
+    <w:p>
+      <w:pPr>
+        <w:spacing w:line="360" w:lineRule="auto"/>
+        <w:jc w:val="both"/>
+      </w:pPr>
+      <w:r>
+        <w:rPr>
+          <w:b/>
+          <w:bCs/>
+          <w:u w:val="single"/>
+        </w:rPr>
+        <w:t>Action Points:</w:t>
+      </w:r>
+    </w:p>
+    <w:p>
+      <w:pPr>
+        <w:numPr>
+          <w:ilvl w:val="0"/>
+          <w:numId w:val="6"/>
+        </w:numPr>
+        <w:spacing w:line="360" w:lineRule="auto"/>
+        <w:jc w:val="both"/>
+      </w:pPr>
+      <w:r>
+        <w:t>Review software engineering notes on use cases vs user scenarios vs functional requirements; relabel the relevant dissertation section appropriately.</w:t>
+      </w:r>
+    </w:p>
+    <w:p>
+      <w:pPr>
+        <w:numPr>
+          <w:ilvl w:val="0"/>
+          <w:numId w:val="6"/>
+        </w:numPr>
+        <w:spacing w:line="360" w:lineRule="auto"/>
+        <w:jc w:val="both"/>
+      </w:pPr>
+      <w:r>
+        <w:lastRenderedPageBreak/>
+        <w:t>Expand Section 3.6 (User Interface Design): add discussion of established chatroom UI design patterns from the literature, include wireframes, and ensure balance between front-end and back-end coverage.</w:t>
+      </w:r>
+    </w:p>
+    <w:p>
+      <w:pPr>
+        <w:numPr>
+          <w:ilvl w:val="0"/>
+          <w:numId w:val="6"/>
+        </w:numPr>
+        <w:spacing w:line="360" w:lineRule="auto"/>
+        <w:jc w:val="both"/>
+      </w:pPr>
+      <w:r>
+        <w:t xml:space="preserve">Add clarifying technology labels to Chapter 4 section headings (e.g., </w:t>
+      </w:r>
+      <w:proofErr w:type="spellStart"/>
+      <w:r>
+        <w:t>WebSockets</w:t>
+      </w:r>
+      <w:proofErr w:type="spellEnd"/>
+      <w:r>
+        <w:t>, Socket.IO).</w:t>
+      </w:r>
+    </w:p>
+    <w:p>
+      <w:pPr>
+        <w:numPr>
+          <w:ilvl w:val="0"/>
+          <w:numId w:val="6"/>
+        </w:numPr>
+        <w:spacing w:line="360" w:lineRule="auto"/>
+        <w:jc w:val="both"/>
+      </w:pPr>
+      <w:r>
+        <w:t>Restructure Chapters 5 and 6 to align with the project handbook: Testing as a standalone chapter; System Evaluation and Experimental Results as a separate chapter structured around objectives and research questions.</w:t>
+      </w:r>
+    </w:p>
+    <w:p>
+      <w:pPr>
+        <w:numPr>
+          <w:ilvl w:val="0"/>
+          <w:numId w:val="6"/>
+        </w:numPr>
+        <w:spacing w:line="360" w:lineRule="auto"/>
+        <w:jc w:val="both"/>
+      </w:pPr>
+      <w:r>
+        <w:t>In the Testing chapter, emphasise: (1) what testing results reveal about software quality, and (2) what changes were made because of testing.</w:t>
+      </w:r>
+    </w:p>
+    <w:p>
+      <w:pPr>
+        <w:numPr>
+          <w:ilvl w:val="0"/>
+          <w:numId w:val="6"/>
+        </w:numPr>
+        <w:spacing w:line="360" w:lineRule="auto"/>
+        <w:jc w:val="both"/>
+      </w:pPr>
+      <w:r>
+        <w:t>Place detailed SBT session reports in the appendix; summarise key findings and impact in the main text.</w:t>
+      </w:r>
+    </w:p>
+    <w:p>
+      <w:pPr>
+        <w:numPr>
+          <w:ilvl w:val="0"/>
+          <w:numId w:val="6"/>
+        </w:numPr>
+        <w:spacing w:line="360" w:lineRule="auto"/>
+        <w:jc w:val="both"/>
+      </w:pPr>
+      <w:r>
+        <w:t>Continue dissertation writing over the Easter break.</w:t>
+      </w:r>
+    </w:p>
+    <w:p>
+      <w:pPr>
+        <w:spacing w:line="360" w:lineRule="auto"/>
+        <w:jc w:val="both"/>
+      </w:pPr>
+    </w:p>
+    <w:p>
+      <w:pPr>
+        <w:spacing w:line="360" w:lineRule="auto"/>
+        <w:jc w:val="both"/>
+      </w:pPr>
+      <w:r>
+        <w:rPr>
+          <w:b/>
+          <w:bCs/>
+        </w:rPr>
+        <w:t xml:space="preserve">Date of next meeting: </w:t>
+      </w:r>
+      <w:r>
+        <w:t>14/04/2026 (11.00)</w:t>
+      </w:r>
+    </w:p>
+    <w:p>
+      <w:pPr>
+        <w:spacing w:line="360" w:lineRule="auto"/>
+        <w:jc w:val="both"/>
+      </w:pPr>
+    </w:p>
+    <w:p>
+      <w:pPr>
+        <w:spacing w:line="360" w:lineRule="auto"/>
+        <w:jc w:val="both"/>
+      </w:pPr>
+      <w:r>
+        <w:rPr>
+          <w:i/>
+          <w:iCs/>
+        </w:rPr>
+        <w:t>Agreed minutes should be initialled by the supervisor.</w:t>
+      </w:r>
+    </w:p>
+    <w:p>
+      <w:pPr>
+        <w:spacing w:line="360" w:lineRule="auto"/>
+        <w:jc w:val="both"/>
+      </w:pPr>
+      <w:r>
+        <w:rPr>
+          <w:b/>
+          <w:bCs/>
+        </w:rPr>
+        <w:t>Supervisor’s Initials:</w:t>
+      </w:r>
+      <w:r>
+        <w:t xml:space="preserve"> ___________ Date: ___________</w:t>
+      </w:r>
+    </w:p>
+    <w:p>
+      <w:pPr>
+        <w:spacing w:line="360" w:lineRule="auto"/>
+        <w:jc w:val="both"/>
+      </w:pPr>
+    </w:p>
+    <w:p>
+      <w:pPr>
+        <w:spacing w:line="360" w:lineRule="auto"/>
+        <w:jc w:val="both"/>
+      </w:pPr>
+      <w:r>
+        <w:rPr>
+          <w:b/>
+          <w:bCs/>
+          <w:u w:val="single"/>
+        </w:rPr>
+        <w:t>Supervisor’s Comments:</w:t>
+      </w:r>
     </w:p>
     <w:p>
       <w:pPr>
@@ -3557,6 +5237,63 @@
 <file path=word/numbering.xml><?xml version="1.0" encoding="utf-8"?>
 <w:numbering xmlns:wpc="http://schemas.microsoft.com/office/word/2010/wordprocessingCanvas" xmlns:cx="http://schemas.microsoft.com/office/drawing/2014/chartex" xmlns:cx1="http://schemas.microsoft.com/office/drawing/2015/9/8/chartex" xmlns:cx2="http://schemas.microsoft.com/office/drawing/2015/10/21/chartex" xmlns:cx3="http://schemas.microsoft.com/office/drawing/2016/5/9/chartex" xmlns:cx4="http://schemas.microsoft.com/office/drawing/2016/5/10/chartex" xmlns:cx5="http://schemas.microsoft.com/office/drawing/2016/5/11/chartex" xmlns:cx6="http://schemas.microsoft.com/office/drawing/2016/5/12/chartex" xmlns:cx7="http://schemas.microsoft.com/office/drawing/2016/5/13/chartex" xmlns:cx8="http://schemas.microsoft.com/office/drawing/2016/5/14/chartex" xmlns:mc="http://schemas.openxmlformats.org/markup-compatibility/2006" xmlns:aink="http://schemas.microsoft.com/office/drawing/2016/ink" xmlns:am3d="http://schemas.microsoft.com/office/drawing/2017/model3d" xmlns:o="urn:schemas-microsoft-com:office:office" xmlns:oel="http://schemas.microsoft.com/office/2019/extlst" xmlns:r="http://schemas.openxmlformats.org/officeDocument/2006/relationships" xmlns:m="http://schemas.openxmlformats.org/officeDocument/2006/math" xmlns:v="urn:schemas-microsoft-com:vml" xmlns:wp14="http://schemas.microsoft.com/office/word/2010/wordprocessingDrawing" xmlns:wp="http://schemas.openxmlformats.org/drawingml/2006/wordprocessingDrawing" xmlns:w10="urn:schemas-microsoft-com:office:word" xmlns:w="http://schemas.openxmlformats.org/wordprocessingml/2006/main" xmlns:w14="http://schemas.microsoft.com/office/word/2010/wordml" xmlns:w15="http://schemas.microsoft.com/office/word/2012/wordml" xmlns:w16cex="http://schemas.microsoft.com/office/word/2018/wordml/cex" xmlns:w16cid="http://schemas.microsoft.com/office/word/2016/wordml/cid" xmlns:w16="http://schemas.microsoft.com/office/word/2018/wordml" xmlns:w16du="http://schemas.microsoft.com/office/word/2023/wordml/word16du" xmlns:w16sdtdh="http://schemas.microsoft.com/office/word/2020/wordml/sdtdatahash" xmlns:w16sdtfl="http://schemas.microsoft.com/office/word/2024/wordml/sdtformatlock" xmlns:w16se="http://schemas.microsoft.com/office/word/2015/wordml/symex" xmlns:wpg="http://schemas.microsoft.com/office/word/2010/wordprocessingGroup" xmlns:wpi="http://schemas.microsoft.com/office/word/2010/wordprocessingInk" xmlns:wne="http://schemas.microsoft.com/office/word/2006/wordml" xmlns:wps="http://schemas.microsoft.com/office/word/2010/wordprocessingShape" mc:Ignorable="w14 w15 w16se w16cid w16 w16cex w16sdtdh w16sdtfl w16du wp14">
   <w:abstractNum w:abstractNumId="0" w15:restartNumberingAfterBreak="0">
+    <w:nsid w:val="132C3F03"/>
+    <w:multiLevelType w:val="hybridMultilevel"/>
+    <w:tmpl w:val="48960200"/>
+    <w:lvl w:ilvl="0" w:tplc="34F86D80">
+      <w:start w:val="1"/>
+      <w:numFmt w:val="bullet"/>
+      <w:lvlText w:val="•"/>
+      <w:lvlJc w:val="left"/>
+      <w:pPr>
+        <w:ind w:left="720" w:hanging="360"/>
+      </w:pPr>
+      <w:rPr>
+        <w:rFonts w:ascii="Symbol" w:eastAsia="Symbol" w:hAnsi="Symbol" w:cs="Symbol"/>
+      </w:rPr>
+    </w:lvl>
+    <w:lvl w:ilvl="1" w:tplc="43685C70">
+      <w:numFmt w:val="decimal"/>
+      <w:lvlText w:val=""/>
+      <w:lvlJc w:val="left"/>
+    </w:lvl>
+    <w:lvl w:ilvl="2" w:tplc="9032335C">
+      <w:numFmt w:val="decimal"/>
+      <w:lvlText w:val=""/>
+      <w:lvlJc w:val="left"/>
+    </w:lvl>
+    <w:lvl w:ilvl="3" w:tplc="A25C0E38">
+      <w:numFmt w:val="decimal"/>
+      <w:lvlText w:val=""/>
+      <w:lvlJc w:val="left"/>
+    </w:lvl>
+    <w:lvl w:ilvl="4" w:tplc="C9D8E2AE">
+      <w:numFmt w:val="decimal"/>
+      <w:lvlText w:val=""/>
+      <w:lvlJc w:val="left"/>
+    </w:lvl>
+    <w:lvl w:ilvl="5" w:tplc="BA2E1020">
+      <w:numFmt w:val="decimal"/>
+      <w:lvlText w:val=""/>
+      <w:lvlJc w:val="left"/>
+    </w:lvl>
+    <w:lvl w:ilvl="6" w:tplc="DE227944">
+      <w:numFmt w:val="decimal"/>
+      <w:lvlText w:val=""/>
+      <w:lvlJc w:val="left"/>
+    </w:lvl>
+    <w:lvl w:ilvl="7" w:tplc="8B56C82C">
+      <w:numFmt w:val="decimal"/>
+      <w:lvlText w:val=""/>
+      <w:lvlJc w:val="left"/>
+    </w:lvl>
+    <w:lvl w:ilvl="8" w:tplc="C90A20A4">
+      <w:numFmt w:val="decimal"/>
+      <w:lvlText w:val=""/>
+      <w:lvlJc w:val="left"/>
+    </w:lvl>
+  </w:abstractNum>
+  <w:abstractNum w:abstractNumId="1" w15:restartNumberingAfterBreak="0">
     <w:nsid w:val="147C1EEC"/>
     <w:multiLevelType w:val="hybridMultilevel"/>
     <w:tmpl w:val="FE48B524"/>
@@ -3617,7 +5354,7 @@
       <w:lvlJc w:val="left"/>
     </w:lvl>
   </w:abstractNum>
-  <w:abstractNum w:abstractNumId="1" w15:restartNumberingAfterBreak="0">
+  <w:abstractNum w:abstractNumId="2" w15:restartNumberingAfterBreak="0">
     <w:nsid w:val="17ED0811"/>
     <w:multiLevelType w:val="hybridMultilevel"/>
     <w:tmpl w:val="5BB465E6"/>
@@ -3674,7 +5411,7 @@
       <w:lvlJc w:val="left"/>
     </w:lvl>
   </w:abstractNum>
-  <w:abstractNum w:abstractNumId="2" w15:restartNumberingAfterBreak="0">
+  <w:abstractNum w:abstractNumId="3" w15:restartNumberingAfterBreak="0">
     <w:nsid w:val="1B803763"/>
     <w:multiLevelType w:val="hybridMultilevel"/>
     <w:tmpl w:val="1B063F92"/>
@@ -3731,7 +5468,64 @@
       <w:lvlJc w:val="left"/>
     </w:lvl>
   </w:abstractNum>
-  <w:abstractNum w:abstractNumId="3" w15:restartNumberingAfterBreak="0">
+  <w:abstractNum w:abstractNumId="4" w15:restartNumberingAfterBreak="0">
+    <w:nsid w:val="1C291994"/>
+    <w:multiLevelType w:val="hybridMultilevel"/>
+    <w:tmpl w:val="0B46BBA8"/>
+    <w:lvl w:ilvl="0" w:tplc="A762D27C">
+      <w:start w:val="1"/>
+      <w:numFmt w:val="bullet"/>
+      <w:lvlText w:val="•"/>
+      <w:lvlJc w:val="left"/>
+      <w:pPr>
+        <w:ind w:left="720" w:hanging="360"/>
+      </w:pPr>
+      <w:rPr>
+        <w:rFonts w:ascii="Symbol" w:eastAsia="Symbol" w:hAnsi="Symbol" w:cs="Symbol"/>
+      </w:rPr>
+    </w:lvl>
+    <w:lvl w:ilvl="1" w:tplc="7A92CED6">
+      <w:numFmt w:val="decimal"/>
+      <w:lvlText w:val=""/>
+      <w:lvlJc w:val="left"/>
+    </w:lvl>
+    <w:lvl w:ilvl="2" w:tplc="8D60410C">
+      <w:numFmt w:val="decimal"/>
+      <w:lvlText w:val=""/>
+      <w:lvlJc w:val="left"/>
+    </w:lvl>
+    <w:lvl w:ilvl="3" w:tplc="CA0A8EFE">
+      <w:numFmt w:val="decimal"/>
+      <w:lvlText w:val=""/>
+      <w:lvlJc w:val="left"/>
+    </w:lvl>
+    <w:lvl w:ilvl="4" w:tplc="16586CEA">
+      <w:numFmt w:val="decimal"/>
+      <w:lvlText w:val=""/>
+      <w:lvlJc w:val="left"/>
+    </w:lvl>
+    <w:lvl w:ilvl="5" w:tplc="BED6B2EA">
+      <w:numFmt w:val="decimal"/>
+      <w:lvlText w:val=""/>
+      <w:lvlJc w:val="left"/>
+    </w:lvl>
+    <w:lvl w:ilvl="6" w:tplc="45E02F22">
+      <w:numFmt w:val="decimal"/>
+      <w:lvlText w:val=""/>
+      <w:lvlJc w:val="left"/>
+    </w:lvl>
+    <w:lvl w:ilvl="7" w:tplc="7D6617A8">
+      <w:numFmt w:val="decimal"/>
+      <w:lvlText w:val=""/>
+      <w:lvlJc w:val="left"/>
+    </w:lvl>
+    <w:lvl w:ilvl="8" w:tplc="CA549AEE">
+      <w:numFmt w:val="decimal"/>
+      <w:lvlText w:val=""/>
+      <w:lvlJc w:val="left"/>
+    </w:lvl>
+  </w:abstractNum>
+  <w:abstractNum w:abstractNumId="5" w15:restartNumberingAfterBreak="0">
     <w:nsid w:val="1CA40142"/>
     <w:multiLevelType w:val="hybridMultilevel"/>
     <w:tmpl w:val="DDD6F248"/>
@@ -3786,25 +5580,37 @@
     </w:lvl>
   </w:abstractNum>
   <w:num w:numId="1" w16cid:durableId="1017578605">
+    <w:abstractNumId w:val="5"/>
+    <w:lvlOverride w:ilvl="0">
+      <w:startOverride w:val="1"/>
+    </w:lvlOverride>
+  </w:num>
+  <w:num w:numId="2" w16cid:durableId="1726483715">
+    <w:abstractNumId w:val="1"/>
+    <w:lvlOverride w:ilvl="0">
+      <w:startOverride w:val="1"/>
+    </w:lvlOverride>
+  </w:num>
+  <w:num w:numId="3" w16cid:durableId="1706252129">
     <w:abstractNumId w:val="3"/>
     <w:lvlOverride w:ilvl="0">
       <w:startOverride w:val="1"/>
     </w:lvlOverride>
   </w:num>
-  <w:num w:numId="2" w16cid:durableId="1726483715">
+  <w:num w:numId="4" w16cid:durableId="951204816">
+    <w:abstractNumId w:val="2"/>
+    <w:lvlOverride w:ilvl="0">
+      <w:startOverride w:val="1"/>
+    </w:lvlOverride>
+  </w:num>
+  <w:num w:numId="5" w16cid:durableId="1975715549">
     <w:abstractNumId w:val="0"/>
     <w:lvlOverride w:ilvl="0">
       <w:startOverride w:val="1"/>
     </w:lvlOverride>
   </w:num>
-  <w:num w:numId="3" w16cid:durableId="1706252129">
-    <w:abstractNumId w:val="2"/>
-    <w:lvlOverride w:ilvl="0">
-      <w:startOverride w:val="1"/>
-    </w:lvlOverride>
-  </w:num>
-  <w:num w:numId="4" w16cid:durableId="951204816">
-    <w:abstractNumId w:val="1"/>
+  <w:num w:numId="6" w16cid:durableId="1404714265">
+    <w:abstractNumId w:val="4"/>
     <w:lvlOverride w:ilvl="0">
       <w:startOverride w:val="1"/>
     </w:lvlOverride>

</xml_diff>